<commit_message>
docs: atualiza documentos sobre Ubuntu
</commit_message>
<xml_diff>
--- a/docx/Ubuntu/Ubuntu.docx
+++ b/docx/Ubuntu/Ubuntu.docx
@@ -60,12 +60,12 @@
           <wp:inline distB="114300" distT="114300" distL="114300" distR="114300">
             <wp:extent cx="5731200" cy="4292600"/>
             <wp:effectExtent b="0" l="0" r="0" t="0"/>
-            <wp:docPr id="2" name="image2.jpg"/>
+            <wp:docPr id="2" name="image1.jpg"/>
             <a:graphic>
               <a:graphicData uri="http://schemas.openxmlformats.org/drawingml/2006/picture">
                 <pic:pic>
                   <pic:nvPicPr>
-                    <pic:cNvPr id="0" name="image2.jpg"/>
+                    <pic:cNvPr id="0" name="image1.jpg"/>
                     <pic:cNvPicPr preferRelativeResize="0"/>
                   </pic:nvPicPr>
                   <pic:blipFill>
@@ -215,7 +215,7 @@
     </w:p>
     <w:sdt>
       <w:sdtPr>
-        <w:id w:val="-134340896"/>
+        <w:id w:val="1196032708"/>
         <w:docPartObj>
           <w:docPartGallery w:val="Table of Contents"/>
           <w:docPartUnique w:val="1"/>
@@ -226,14 +226,24 @@
           <w:pPr>
             <w:widowControl w:val="0"/>
             <w:tabs>
-              <w:tab w:val="right" w:leader="dot" w:pos="9025.511811023624"/>
+              <w:tab w:val="right" w:leader="dot" w:pos="12000"/>
             </w:tabs>
             <w:spacing w:before="60" w:line="240" w:lineRule="auto"/>
+            <w:ind w:left="360" w:firstLine="0"/>
             <w:rPr>
-              <w:b w:val="1"/>
-              <w:bCs w:val="1"/>
+              <w:rFonts w:ascii="Arial" w:cs="Arial" w:eastAsia="Arial" w:hAnsi="Arial"/>
+              <w:b w:val="0"/>
+              <w:bCs w:val="0"/>
+              <w:i w:val="0"/>
+              <w:iCs w:val="0"/>
+              <w:smallCaps w:val="0"/>
+              <w:strike w:val="0"/>
               <w:color w:val="000000"/>
+              <w:sz w:val="22"/>
+              <w:szCs w:val="22"/>
               <w:u w:val="none"/>
+              <w:shd w:fill="auto" w:val="clear"/>
+              <w:vertAlign w:val="baseline"/>
             </w:rPr>
           </w:pPr>
           <w:r>
@@ -241,35 +251,29 @@
             <w:instrText xml:space="preserve"> TOC \h \u \z \t "Heading 1,1,Heading 2,2,Heading 3,3,Heading 4,4,Heading 5,5,Heading 6,6,"</w:instrText>
             <w:fldChar w:fldCharType="separate"/>
           </w:r>
-          <w:hyperlink w:anchor="_rriv651qobk4">
+          <w:hyperlink w:anchor="_hrpsrxtx0hai">
             <w:r>
               <w:rPr>
-                <w:b w:val="1"/>
-                <w:bCs w:val="1"/>
+                <w:rFonts w:ascii="Arial" w:cs="Arial" w:eastAsia="Arial" w:hAnsi="Arial"/>
+                <w:b w:val="0"/>
+                <w:bCs w:val="0"/>
+                <w:i w:val="0"/>
+                <w:iCs w:val="0"/>
+                <w:smallCaps w:val="0"/>
+                <w:strike w:val="0"/>
                 <w:color w:val="000000"/>
+                <w:sz w:val="22"/>
+                <w:szCs w:val="22"/>
                 <w:u w:val="none"/>
+                <w:shd w:fill="auto" w:val="clear"/>
+                <w:vertAlign w:val="baseline"/>
                 <w:rtl w:val="0"/>
               </w:rPr>
-              <w:t xml:space="preserve">Comandos Básicos no Terminal</w:t>
+              <w:t xml:space="preserve">O que é um diretório?</w:t>
               <w:tab/>
+              <w:t xml:space="preserve">3</w:t>
             </w:r>
           </w:hyperlink>
-          <w:r>
-            <w:fldChar w:fldCharType="begin"/>
-            <w:instrText xml:space="preserve"> PAGEREF _rriv651qobk4 \h </w:instrText>
-            <w:fldChar w:fldCharType="separate"/>
-          </w:r>
-          <w:r>
-            <w:rPr>
-              <w:b w:val="1"/>
-              <w:bCs w:val="1"/>
-              <w:rtl w:val="0"/>
-            </w:rPr>
-            <w:t xml:space="preserve">3</w:t>
-          </w:r>
-          <w:r>
-            <w:fldChar w:fldCharType="end"/>
-          </w:r>
           <w:r>
             <w:rPr>
               <w:rtl w:val="0"/>
@@ -280,45 +284,48 @@
           <w:pPr>
             <w:widowControl w:val="0"/>
             <w:tabs>
-              <w:tab w:val="right" w:leader="dot" w:pos="9025.511811023624"/>
+              <w:tab w:val="right" w:leader="dot" w:pos="12000"/>
             </w:tabs>
             <w:spacing w:before="60" w:line="240" w:lineRule="auto"/>
             <w:rPr>
+              <w:rFonts w:ascii="Arial" w:cs="Arial" w:eastAsia="Arial" w:hAnsi="Arial"/>
               <w:b w:val="1"/>
               <w:bCs w:val="1"/>
+              <w:i w:val="0"/>
+              <w:iCs w:val="0"/>
+              <w:smallCaps w:val="0"/>
+              <w:strike w:val="0"/>
               <w:color w:val="000000"/>
+              <w:sz w:val="22"/>
+              <w:szCs w:val="22"/>
               <w:u w:val="none"/>
+              <w:shd w:fill="auto" w:val="clear"/>
+              <w:vertAlign w:val="baseline"/>
             </w:rPr>
           </w:pPr>
-          <w:hyperlink w:anchor="_idvqtrpkbirm">
+          <w:hyperlink w:anchor="_rriv651qobk4">
             <w:r>
               <w:rPr>
+                <w:rFonts w:ascii="Arial" w:cs="Arial" w:eastAsia="Arial" w:hAnsi="Arial"/>
                 <w:b w:val="1"/>
                 <w:bCs w:val="1"/>
+                <w:i w:val="0"/>
+                <w:iCs w:val="0"/>
+                <w:smallCaps w:val="0"/>
+                <w:strike w:val="0"/>
                 <w:color w:val="000000"/>
+                <w:sz w:val="22"/>
+                <w:szCs w:val="22"/>
                 <w:u w:val="none"/>
+                <w:shd w:fill="auto" w:val="clear"/>
+                <w:vertAlign w:val="baseline"/>
                 <w:rtl w:val="0"/>
               </w:rPr>
-              <w:t xml:space="preserve">Entendendo o Sudo</w:t>
+              <w:t xml:space="preserve">Comandos Básicos no Terminal</w:t>
               <w:tab/>
+              <w:t xml:space="preserve">3</w:t>
             </w:r>
           </w:hyperlink>
-          <w:r>
-            <w:fldChar w:fldCharType="begin"/>
-            <w:instrText xml:space="preserve"> PAGEREF _idvqtrpkbirm \h </w:instrText>
-            <w:fldChar w:fldCharType="separate"/>
-          </w:r>
-          <w:r>
-            <w:rPr>
-              <w:b w:val="1"/>
-              <w:bCs w:val="1"/>
-              <w:rtl w:val="0"/>
-            </w:rPr>
-            <w:t xml:space="preserve">7</w:t>
-          </w:r>
-          <w:r>
-            <w:fldChar w:fldCharType="end"/>
-          </w:r>
           <w:r>
             <w:rPr>
               <w:rtl w:val="0"/>
@@ -329,45 +336,49 @@
           <w:pPr>
             <w:widowControl w:val="0"/>
             <w:tabs>
-              <w:tab w:val="right" w:leader="dot" w:pos="9025.511811023624"/>
+              <w:tab w:val="right" w:leader="dot" w:pos="12000"/>
             </w:tabs>
             <w:spacing w:before="60" w:line="240" w:lineRule="auto"/>
+            <w:ind w:left="360" w:firstLine="0"/>
             <w:rPr>
-              <w:b w:val="1"/>
-              <w:bCs w:val="1"/>
+              <w:rFonts w:ascii="Arial" w:cs="Arial" w:eastAsia="Arial" w:hAnsi="Arial"/>
+              <w:b w:val="0"/>
+              <w:bCs w:val="0"/>
+              <w:i w:val="0"/>
+              <w:iCs w:val="0"/>
+              <w:smallCaps w:val="0"/>
+              <w:strike w:val="0"/>
               <w:color w:val="000000"/>
+              <w:sz w:val="22"/>
+              <w:szCs w:val="22"/>
               <w:u w:val="none"/>
+              <w:shd w:fill="auto" w:val="clear"/>
+              <w:vertAlign w:val="baseline"/>
             </w:rPr>
           </w:pPr>
-          <w:hyperlink w:anchor="_ehp3d3tg07">
+          <w:hyperlink w:anchor="_vmtayzdxbwu9">
             <w:r>
               <w:rPr>
-                <w:b w:val="1"/>
-                <w:bCs w:val="1"/>
+                <w:rFonts w:ascii="Arial" w:cs="Arial" w:eastAsia="Arial" w:hAnsi="Arial"/>
+                <w:b w:val="0"/>
+                <w:bCs w:val="0"/>
+                <w:i w:val="0"/>
+                <w:iCs w:val="0"/>
+                <w:smallCaps w:val="0"/>
+                <w:strike w:val="0"/>
                 <w:color w:val="000000"/>
+                <w:sz w:val="22"/>
+                <w:szCs w:val="22"/>
                 <w:u w:val="none"/>
+                <w:shd w:fill="auto" w:val="clear"/>
+                <w:vertAlign w:val="baseline"/>
                 <w:rtl w:val="0"/>
               </w:rPr>
-              <w:t xml:space="preserve">Atualizando Pacotes do Sistema</w:t>
+              <w:t xml:space="preserve">Obtendo o manual de comandos</w:t>
               <w:tab/>
+              <w:t xml:space="preserve">3</w:t>
             </w:r>
           </w:hyperlink>
-          <w:r>
-            <w:fldChar w:fldCharType="begin"/>
-            <w:instrText xml:space="preserve"> PAGEREF _ehp3d3tg07 \h </w:instrText>
-            <w:fldChar w:fldCharType="separate"/>
-          </w:r>
-          <w:r>
-            <w:rPr>
-              <w:b w:val="1"/>
-              <w:bCs w:val="1"/>
-              <w:rtl w:val="0"/>
-            </w:rPr>
-            <w:t xml:space="preserve">7</w:t>
-          </w:r>
-          <w:r>
-            <w:fldChar w:fldCharType="end"/>
-          </w:r>
           <w:r>
             <w:rPr>
               <w:rtl w:val="0"/>
@@ -378,45 +389,49 @@
           <w:pPr>
             <w:widowControl w:val="0"/>
             <w:tabs>
-              <w:tab w:val="right" w:leader="dot" w:pos="9025.511811023624"/>
+              <w:tab w:val="right" w:leader="dot" w:pos="12000"/>
             </w:tabs>
             <w:spacing w:before="60" w:line="240" w:lineRule="auto"/>
+            <w:ind w:left="360" w:firstLine="0"/>
             <w:rPr>
-              <w:b w:val="1"/>
-              <w:bCs w:val="1"/>
+              <w:rFonts w:ascii="Arial" w:cs="Arial" w:eastAsia="Arial" w:hAnsi="Arial"/>
+              <w:b w:val="0"/>
+              <w:bCs w:val="0"/>
+              <w:i w:val="0"/>
+              <w:iCs w:val="0"/>
+              <w:smallCaps w:val="0"/>
+              <w:strike w:val="0"/>
               <w:color w:val="000000"/>
+              <w:sz w:val="22"/>
+              <w:szCs w:val="22"/>
               <w:u w:val="none"/>
+              <w:shd w:fill="auto" w:val="clear"/>
+              <w:vertAlign w:val="baseline"/>
             </w:rPr>
           </w:pPr>
-          <w:hyperlink w:anchor="_f42wb26veks6">
+          <w:hyperlink w:anchor="_7umjpmq4ehzx">
             <w:r>
               <w:rPr>
-                <w:b w:val="1"/>
-                <w:bCs w:val="1"/>
+                <w:rFonts w:ascii="Arial" w:cs="Arial" w:eastAsia="Arial" w:hAnsi="Arial"/>
+                <w:b w:val="0"/>
+                <w:bCs w:val="0"/>
+                <w:i w:val="0"/>
+                <w:iCs w:val="0"/>
+                <w:smallCaps w:val="0"/>
+                <w:strike w:val="0"/>
                 <w:color w:val="000000"/>
+                <w:sz w:val="22"/>
+                <w:szCs w:val="22"/>
                 <w:u w:val="none"/>
+                <w:shd w:fill="auto" w:val="clear"/>
+                <w:vertAlign w:val="baseline"/>
                 <w:rtl w:val="0"/>
               </w:rPr>
-              <w:t xml:space="preserve">Instalando Softwares</w:t>
+              <w:t xml:space="preserve">Limpar o terminal</w:t>
               <w:tab/>
+              <w:t xml:space="preserve">4</w:t>
             </w:r>
           </w:hyperlink>
-          <w:r>
-            <w:fldChar w:fldCharType="begin"/>
-            <w:instrText xml:space="preserve"> PAGEREF _f42wb26veks6 \h </w:instrText>
-            <w:fldChar w:fldCharType="separate"/>
-          </w:r>
-          <w:r>
-            <w:rPr>
-              <w:b w:val="1"/>
-              <w:bCs w:val="1"/>
-              <w:rtl w:val="0"/>
-            </w:rPr>
-            <w:t xml:space="preserve">8</w:t>
-          </w:r>
-          <w:r>
-            <w:fldChar w:fldCharType="end"/>
-          </w:r>
           <w:r>
             <w:rPr>
               <w:rtl w:val="0"/>
@@ -427,45 +442,49 @@
           <w:pPr>
             <w:widowControl w:val="0"/>
             <w:tabs>
-              <w:tab w:val="right" w:leader="dot" w:pos="9025.511811023624"/>
+              <w:tab w:val="right" w:leader="dot" w:pos="12000"/>
             </w:tabs>
             <w:spacing w:before="60" w:line="240" w:lineRule="auto"/>
+            <w:ind w:left="360" w:firstLine="0"/>
             <w:rPr>
-              <w:b w:val="1"/>
-              <w:bCs w:val="1"/>
+              <w:rFonts w:ascii="Arial" w:cs="Arial" w:eastAsia="Arial" w:hAnsi="Arial"/>
+              <w:b w:val="0"/>
+              <w:bCs w:val="0"/>
+              <w:i w:val="0"/>
+              <w:iCs w:val="0"/>
+              <w:smallCaps w:val="0"/>
+              <w:strike w:val="0"/>
               <w:color w:val="000000"/>
+              <w:sz w:val="22"/>
+              <w:szCs w:val="22"/>
               <w:u w:val="none"/>
+              <w:shd w:fill="auto" w:val="clear"/>
+              <w:vertAlign w:val="baseline"/>
             </w:rPr>
           </w:pPr>
-          <w:hyperlink w:anchor="_41zb618drwsd">
+          <w:hyperlink w:anchor="_c7eyj9d97243">
             <w:r>
               <w:rPr>
-                <w:b w:val="1"/>
-                <w:bCs w:val="1"/>
+                <w:rFonts w:ascii="Arial" w:cs="Arial" w:eastAsia="Arial" w:hAnsi="Arial"/>
+                <w:b w:val="0"/>
+                <w:bCs w:val="0"/>
+                <w:i w:val="0"/>
+                <w:iCs w:val="0"/>
+                <w:smallCaps w:val="0"/>
+                <w:strike w:val="0"/>
                 <w:color w:val="000000"/>
+                <w:sz w:val="22"/>
+                <w:szCs w:val="22"/>
                 <w:u w:val="none"/>
+                <w:shd w:fill="auto" w:val="clear"/>
+                <w:vertAlign w:val="baseline"/>
                 <w:rtl w:val="0"/>
               </w:rPr>
-              <w:t xml:space="preserve">Editores de Texto no Terminal</w:t>
+              <w:t xml:space="preserve">O histórico</w:t>
               <w:tab/>
+              <w:t xml:space="preserve">4</w:t>
             </w:r>
           </w:hyperlink>
-          <w:r>
-            <w:fldChar w:fldCharType="begin"/>
-            <w:instrText xml:space="preserve"> PAGEREF _41zb618drwsd \h </w:instrText>
-            <w:fldChar w:fldCharType="separate"/>
-          </w:r>
-          <w:r>
-            <w:rPr>
-              <w:b w:val="1"/>
-              <w:bCs w:val="1"/>
-              <w:rtl w:val="0"/>
-            </w:rPr>
-            <w:t xml:space="preserve">9</w:t>
-          </w:r>
-          <w:r>
-            <w:fldChar w:fldCharType="end"/>
-          </w:r>
           <w:r>
             <w:rPr>
               <w:rtl w:val="0"/>
@@ -476,40 +495,49 @@
           <w:pPr>
             <w:widowControl w:val="0"/>
             <w:tabs>
-              <w:tab w:val="right" w:leader="dot" w:pos="9025.511811023624"/>
+              <w:tab w:val="right" w:leader="dot" w:pos="12000"/>
             </w:tabs>
             <w:spacing w:before="60" w:line="240" w:lineRule="auto"/>
             <w:ind w:left="360" w:firstLine="0"/>
             <w:rPr>
+              <w:rFonts w:ascii="Arial" w:cs="Arial" w:eastAsia="Arial" w:hAnsi="Arial"/>
+              <w:b w:val="0"/>
+              <w:bCs w:val="0"/>
+              <w:i w:val="0"/>
+              <w:iCs w:val="0"/>
+              <w:smallCaps w:val="0"/>
+              <w:strike w:val="0"/>
               <w:color w:val="000000"/>
+              <w:sz w:val="22"/>
+              <w:szCs w:val="22"/>
               <w:u w:val="none"/>
+              <w:shd w:fill="auto" w:val="clear"/>
+              <w:vertAlign w:val="baseline"/>
             </w:rPr>
           </w:pPr>
-          <w:hyperlink w:anchor="_m662ufqzh7ul">
+          <w:hyperlink w:anchor="_5nnhc9g8doy0">
             <w:r>
               <w:rPr>
+                <w:rFonts w:ascii="Arial" w:cs="Arial" w:eastAsia="Arial" w:hAnsi="Arial"/>
+                <w:b w:val="0"/>
+                <w:bCs w:val="0"/>
+                <w:i w:val="0"/>
+                <w:iCs w:val="0"/>
+                <w:smallCaps w:val="0"/>
+                <w:strike w:val="0"/>
                 <w:color w:val="000000"/>
+                <w:sz w:val="22"/>
+                <w:szCs w:val="22"/>
                 <w:u w:val="none"/>
+                <w:shd w:fill="auto" w:val="clear"/>
+                <w:vertAlign w:val="baseline"/>
                 <w:rtl w:val="0"/>
               </w:rPr>
-              <w:t xml:space="preserve">Nano</w:t>
+              <w:t xml:space="preserve">Acessar pastas/diretórios</w:t>
               <w:tab/>
+              <w:t xml:space="preserve">4</w:t>
             </w:r>
           </w:hyperlink>
-          <w:r>
-            <w:fldChar w:fldCharType="begin"/>
-            <w:instrText xml:space="preserve"> PAGEREF _m662ufqzh7ul \h </w:instrText>
-            <w:fldChar w:fldCharType="separate"/>
-          </w:r>
-          <w:r>
-            <w:rPr>
-              <w:rtl w:val="0"/>
-            </w:rPr>
-            <w:t xml:space="preserve">9</w:t>
-          </w:r>
-          <w:r>
-            <w:fldChar w:fldCharType="end"/>
-          </w:r>
           <w:r>
             <w:rPr>
               <w:rtl w:val="0"/>
@@ -520,40 +548,49 @@
           <w:pPr>
             <w:widowControl w:val="0"/>
             <w:tabs>
-              <w:tab w:val="right" w:leader="dot" w:pos="9025.511811023624"/>
+              <w:tab w:val="right" w:leader="dot" w:pos="12000"/>
             </w:tabs>
             <w:spacing w:before="60" w:line="240" w:lineRule="auto"/>
             <w:ind w:left="360" w:firstLine="0"/>
             <w:rPr>
+              <w:rFonts w:ascii="Arial" w:cs="Arial" w:eastAsia="Arial" w:hAnsi="Arial"/>
+              <w:b w:val="0"/>
+              <w:bCs w:val="0"/>
+              <w:i w:val="0"/>
+              <w:iCs w:val="0"/>
+              <w:smallCaps w:val="0"/>
+              <w:strike w:val="0"/>
               <w:color w:val="000000"/>
+              <w:sz w:val="22"/>
+              <w:szCs w:val="22"/>
               <w:u w:val="none"/>
+              <w:shd w:fill="auto" w:val="clear"/>
+              <w:vertAlign w:val="baseline"/>
             </w:rPr>
           </w:pPr>
-          <w:hyperlink w:anchor="_emm90hbab6er">
+          <w:hyperlink w:anchor="_u0bc2jlsxlyx">
             <w:r>
               <w:rPr>
+                <w:rFonts w:ascii="Arial" w:cs="Arial" w:eastAsia="Arial" w:hAnsi="Arial"/>
+                <w:b w:val="0"/>
+                <w:bCs w:val="0"/>
+                <w:i w:val="0"/>
+                <w:iCs w:val="0"/>
+                <w:smallCaps w:val="0"/>
+                <w:strike w:val="0"/>
                 <w:color w:val="000000"/>
+                <w:sz w:val="22"/>
+                <w:szCs w:val="22"/>
                 <w:u w:val="none"/>
+                <w:shd w:fill="auto" w:val="clear"/>
+                <w:vertAlign w:val="baseline"/>
                 <w:rtl w:val="0"/>
               </w:rPr>
-              <w:t xml:space="preserve">Vim</w:t>
+              <w:t xml:space="preserve">Criar pastas/diretórios</w:t>
               <w:tab/>
+              <w:t xml:space="preserve">5</w:t>
             </w:r>
           </w:hyperlink>
-          <w:r>
-            <w:fldChar w:fldCharType="begin"/>
-            <w:instrText xml:space="preserve"> PAGEREF _emm90hbab6er \h </w:instrText>
-            <w:fldChar w:fldCharType="separate"/>
-          </w:r>
-          <w:r>
-            <w:rPr>
-              <w:rtl w:val="0"/>
-            </w:rPr>
-            <w:t xml:space="preserve">11</w:t>
-          </w:r>
-          <w:r>
-            <w:fldChar w:fldCharType="end"/>
-          </w:r>
           <w:r>
             <w:rPr>
               <w:rtl w:val="0"/>
@@ -564,45 +601,49 @@
           <w:pPr>
             <w:widowControl w:val="0"/>
             <w:tabs>
-              <w:tab w:val="right" w:leader="dot" w:pos="9025.511811023624"/>
+              <w:tab w:val="right" w:leader="dot" w:pos="12000"/>
             </w:tabs>
             <w:spacing w:before="60" w:line="240" w:lineRule="auto"/>
+            <w:ind w:left="360" w:firstLine="0"/>
             <w:rPr>
-              <w:b w:val="1"/>
-              <w:bCs w:val="1"/>
+              <w:rFonts w:ascii="Arial" w:cs="Arial" w:eastAsia="Arial" w:hAnsi="Arial"/>
+              <w:b w:val="0"/>
+              <w:bCs w:val="0"/>
+              <w:i w:val="0"/>
+              <w:iCs w:val="0"/>
+              <w:smallCaps w:val="0"/>
+              <w:strike w:val="0"/>
               <w:color w:val="000000"/>
+              <w:sz w:val="22"/>
+              <w:szCs w:val="22"/>
               <w:u w:val="none"/>
+              <w:shd w:fill="auto" w:val="clear"/>
+              <w:vertAlign w:val="baseline"/>
             </w:rPr>
           </w:pPr>
-          <w:hyperlink w:anchor="_7irprxdr4ezl">
+          <w:hyperlink w:anchor="_9ym5yusxxpot">
             <w:r>
               <w:rPr>
-                <w:b w:val="1"/>
-                <w:bCs w:val="1"/>
+                <w:rFonts w:ascii="Arial" w:cs="Arial" w:eastAsia="Arial" w:hAnsi="Arial"/>
+                <w:b w:val="0"/>
+                <w:bCs w:val="0"/>
+                <w:i w:val="0"/>
+                <w:iCs w:val="0"/>
+                <w:smallCaps w:val="0"/>
+                <w:strike w:val="0"/>
                 <w:color w:val="000000"/>
+                <w:sz w:val="22"/>
+                <w:szCs w:val="22"/>
                 <w:u w:val="none"/>
+                <w:shd w:fill="auto" w:val="clear"/>
+                <w:vertAlign w:val="baseline"/>
                 <w:rtl w:val="0"/>
               </w:rPr>
-              <w:t xml:space="preserve">Atualizando Aplicativos pelo Terminal</w:t>
+              <w:t xml:space="preserve">Criar arquivos</w:t>
               <w:tab/>
+              <w:t xml:space="preserve">6</w:t>
             </w:r>
           </w:hyperlink>
-          <w:r>
-            <w:fldChar w:fldCharType="begin"/>
-            <w:instrText xml:space="preserve"> PAGEREF _7irprxdr4ezl \h </w:instrText>
-            <w:fldChar w:fldCharType="separate"/>
-          </w:r>
-          <w:r>
-            <w:rPr>
-              <w:b w:val="1"/>
-              <w:bCs w:val="1"/>
-              <w:rtl w:val="0"/>
-            </w:rPr>
-            <w:t xml:space="preserve">13</w:t>
-          </w:r>
-          <w:r>
-            <w:fldChar w:fldCharType="end"/>
-          </w:r>
           <w:r>
             <w:rPr>
               <w:rtl w:val="0"/>
@@ -613,45 +654,49 @@
           <w:pPr>
             <w:widowControl w:val="0"/>
             <w:tabs>
-              <w:tab w:val="right" w:leader="dot" w:pos="9025.511811023624"/>
+              <w:tab w:val="right" w:leader="dot" w:pos="12000"/>
             </w:tabs>
             <w:spacing w:before="60" w:line="240" w:lineRule="auto"/>
+            <w:ind w:left="360" w:firstLine="0"/>
             <w:rPr>
-              <w:b w:val="1"/>
-              <w:bCs w:val="1"/>
+              <w:rFonts w:ascii="Arial" w:cs="Arial" w:eastAsia="Arial" w:hAnsi="Arial"/>
+              <w:b w:val="0"/>
+              <w:bCs w:val="0"/>
+              <w:i w:val="0"/>
+              <w:iCs w:val="0"/>
+              <w:smallCaps w:val="0"/>
+              <w:strike w:val="0"/>
               <w:color w:val="000000"/>
+              <w:sz w:val="22"/>
+              <w:szCs w:val="22"/>
               <w:u w:val="none"/>
+              <w:shd w:fill="auto" w:val="clear"/>
+              <w:vertAlign w:val="baseline"/>
             </w:rPr>
           </w:pPr>
-          <w:hyperlink w:anchor="_3uv23dmq0rkn">
+          <w:hyperlink w:anchor="_xv6oapry1fxr">
             <w:r>
               <w:rPr>
-                <w:b w:val="1"/>
-                <w:bCs w:val="1"/>
+                <w:rFonts w:ascii="Arial" w:cs="Arial" w:eastAsia="Arial" w:hAnsi="Arial"/>
+                <w:b w:val="0"/>
+                <w:bCs w:val="0"/>
+                <w:i w:val="0"/>
+                <w:iCs w:val="0"/>
+                <w:smallCaps w:val="0"/>
+                <w:strike w:val="0"/>
                 <w:color w:val="000000"/>
+                <w:sz w:val="22"/>
+                <w:szCs w:val="22"/>
                 <w:u w:val="none"/>
+                <w:shd w:fill="auto" w:val="clear"/>
+                <w:vertAlign w:val="baseline"/>
                 <w:rtl w:val="0"/>
               </w:rPr>
-              <w:t xml:space="preserve">Criando Aliases (Apelidos)</w:t>
+              <w:t xml:space="preserve">Ler conteúdo de arquivos</w:t>
               <w:tab/>
+              <w:t xml:space="preserve">6</w:t>
             </w:r>
           </w:hyperlink>
-          <w:r>
-            <w:fldChar w:fldCharType="begin"/>
-            <w:instrText xml:space="preserve"> PAGEREF _3uv23dmq0rkn \h </w:instrText>
-            <w:fldChar w:fldCharType="separate"/>
-          </w:r>
-          <w:r>
-            <w:rPr>
-              <w:b w:val="1"/>
-              <w:bCs w:val="1"/>
-              <w:rtl w:val="0"/>
-            </w:rPr>
-            <w:t xml:space="preserve">13</w:t>
-          </w:r>
-          <w:r>
-            <w:fldChar w:fldCharType="end"/>
-          </w:r>
           <w:r>
             <w:rPr>
               <w:rtl w:val="0"/>
@@ -662,45 +707,996 @@
           <w:pPr>
             <w:widowControl w:val="0"/>
             <w:tabs>
-              <w:tab w:val="right" w:leader="dot" w:pos="9025.511811023624"/>
+              <w:tab w:val="right" w:leader="dot" w:pos="12000"/>
+            </w:tabs>
+            <w:spacing w:before="60" w:line="240" w:lineRule="auto"/>
+            <w:ind w:left="360" w:firstLine="0"/>
+            <w:rPr>
+              <w:rFonts w:ascii="Arial" w:cs="Arial" w:eastAsia="Arial" w:hAnsi="Arial"/>
+              <w:b w:val="0"/>
+              <w:bCs w:val="0"/>
+              <w:i w:val="0"/>
+              <w:iCs w:val="0"/>
+              <w:smallCaps w:val="0"/>
+              <w:strike w:val="0"/>
+              <w:color w:val="000000"/>
+              <w:sz w:val="22"/>
+              <w:szCs w:val="22"/>
+              <w:u w:val="none"/>
+              <w:shd w:fill="auto" w:val="clear"/>
+              <w:vertAlign w:val="baseline"/>
+            </w:rPr>
+          </w:pPr>
+          <w:hyperlink w:anchor="_holdkliwkguo">
+            <w:r>
+              <w:rPr>
+                <w:rFonts w:ascii="Arial" w:cs="Arial" w:eastAsia="Arial" w:hAnsi="Arial"/>
+                <w:b w:val="0"/>
+                <w:bCs w:val="0"/>
+                <w:i w:val="0"/>
+                <w:iCs w:val="0"/>
+                <w:smallCaps w:val="0"/>
+                <w:strike w:val="0"/>
+                <w:color w:val="000000"/>
+                <w:sz w:val="22"/>
+                <w:szCs w:val="22"/>
+                <w:u w:val="none"/>
+                <w:shd w:fill="auto" w:val="clear"/>
+                <w:vertAlign w:val="baseline"/>
+                <w:rtl w:val="0"/>
+              </w:rPr>
+              <w:t xml:space="preserve">Listar conteúdo de uma pasta (arquivos, pastas)</w:t>
+              <w:tab/>
+              <w:t xml:space="preserve">6</w:t>
+            </w:r>
+          </w:hyperlink>
+          <w:r>
+            <w:rPr>
+              <w:rtl w:val="0"/>
+            </w:rPr>
+          </w:r>
+        </w:p>
+        <w:p>
+          <w:pPr>
+            <w:widowControl w:val="0"/>
+            <w:tabs>
+              <w:tab w:val="right" w:leader="dot" w:pos="12000"/>
+            </w:tabs>
+            <w:spacing w:before="60" w:line="240" w:lineRule="auto"/>
+            <w:ind w:left="360" w:firstLine="0"/>
+            <w:rPr>
+              <w:rFonts w:ascii="Arial" w:cs="Arial" w:eastAsia="Arial" w:hAnsi="Arial"/>
+              <w:b w:val="0"/>
+              <w:bCs w:val="0"/>
+              <w:i w:val="0"/>
+              <w:iCs w:val="0"/>
+              <w:smallCaps w:val="0"/>
+              <w:strike w:val="0"/>
+              <w:color w:val="000000"/>
+              <w:sz w:val="22"/>
+              <w:szCs w:val="22"/>
+              <w:u w:val="none"/>
+              <w:shd w:fill="auto" w:val="clear"/>
+              <w:vertAlign w:val="baseline"/>
+            </w:rPr>
+          </w:pPr>
+          <w:hyperlink w:anchor="_hpe1k73qqqyi">
+            <w:r>
+              <w:rPr>
+                <w:rFonts w:ascii="Arial" w:cs="Arial" w:eastAsia="Arial" w:hAnsi="Arial"/>
+                <w:b w:val="0"/>
+                <w:bCs w:val="0"/>
+                <w:i w:val="0"/>
+                <w:iCs w:val="0"/>
+                <w:smallCaps w:val="0"/>
+                <w:strike w:val="0"/>
+                <w:color w:val="000000"/>
+                <w:sz w:val="22"/>
+                <w:szCs w:val="22"/>
+                <w:u w:val="none"/>
+                <w:shd w:fill="auto" w:val="clear"/>
+                <w:vertAlign w:val="baseline"/>
+                <w:rtl w:val="0"/>
+              </w:rPr>
+              <w:t xml:space="preserve">Remover/Apagar</w:t>
+              <w:tab/>
+              <w:t xml:space="preserve">6</w:t>
+            </w:r>
+          </w:hyperlink>
+          <w:r>
+            <w:rPr>
+              <w:rtl w:val="0"/>
+            </w:rPr>
+          </w:r>
+        </w:p>
+        <w:p>
+          <w:pPr>
+            <w:widowControl w:val="0"/>
+            <w:tabs>
+              <w:tab w:val="right" w:leader="dot" w:pos="12000"/>
+            </w:tabs>
+            <w:spacing w:before="60" w:line="240" w:lineRule="auto"/>
+            <w:ind w:left="360" w:firstLine="0"/>
+            <w:rPr>
+              <w:rFonts w:ascii="Arial" w:cs="Arial" w:eastAsia="Arial" w:hAnsi="Arial"/>
+              <w:b w:val="0"/>
+              <w:bCs w:val="0"/>
+              <w:i w:val="0"/>
+              <w:iCs w:val="0"/>
+              <w:smallCaps w:val="0"/>
+              <w:strike w:val="0"/>
+              <w:color w:val="000000"/>
+              <w:sz w:val="22"/>
+              <w:szCs w:val="22"/>
+              <w:u w:val="none"/>
+              <w:shd w:fill="auto" w:val="clear"/>
+              <w:vertAlign w:val="baseline"/>
+            </w:rPr>
+          </w:pPr>
+          <w:hyperlink w:anchor="_mwp722la8yvn">
+            <w:r>
+              <w:rPr>
+                <w:rFonts w:ascii="Arial" w:cs="Arial" w:eastAsia="Arial" w:hAnsi="Arial"/>
+                <w:b w:val="0"/>
+                <w:bCs w:val="0"/>
+                <w:i w:val="0"/>
+                <w:iCs w:val="0"/>
+                <w:smallCaps w:val="0"/>
+                <w:strike w:val="0"/>
+                <w:color w:val="000000"/>
+                <w:sz w:val="22"/>
+                <w:szCs w:val="22"/>
+                <w:u w:val="none"/>
+                <w:shd w:fill="auto" w:val="clear"/>
+                <w:vertAlign w:val="baseline"/>
+                <w:rtl w:val="0"/>
+              </w:rPr>
+              <w:t xml:space="preserve">Remover/Apagar arquivo</w:t>
+              <w:tab/>
+              <w:t xml:space="preserve">7</w:t>
+            </w:r>
+          </w:hyperlink>
+          <w:r>
+            <w:rPr>
+              <w:rtl w:val="0"/>
+            </w:rPr>
+          </w:r>
+        </w:p>
+        <w:p>
+          <w:pPr>
+            <w:widowControl w:val="0"/>
+            <w:tabs>
+              <w:tab w:val="right" w:leader="dot" w:pos="12000"/>
+            </w:tabs>
+            <w:spacing w:before="60" w:line="240" w:lineRule="auto"/>
+            <w:ind w:left="360" w:firstLine="0"/>
+            <w:rPr>
+              <w:rFonts w:ascii="Arial" w:cs="Arial" w:eastAsia="Arial" w:hAnsi="Arial"/>
+              <w:b w:val="0"/>
+              <w:bCs w:val="0"/>
+              <w:i w:val="0"/>
+              <w:iCs w:val="0"/>
+              <w:smallCaps w:val="0"/>
+              <w:strike w:val="0"/>
+              <w:color w:val="000000"/>
+              <w:sz w:val="22"/>
+              <w:szCs w:val="22"/>
+              <w:u w:val="none"/>
+              <w:shd w:fill="auto" w:val="clear"/>
+              <w:vertAlign w:val="baseline"/>
+            </w:rPr>
+          </w:pPr>
+          <w:hyperlink w:anchor="_fo2ns6j6dbyz">
+            <w:r>
+              <w:rPr>
+                <w:rFonts w:ascii="Arial" w:cs="Arial" w:eastAsia="Arial" w:hAnsi="Arial"/>
+                <w:b w:val="0"/>
+                <w:bCs w:val="0"/>
+                <w:i w:val="0"/>
+                <w:iCs w:val="0"/>
+                <w:smallCaps w:val="0"/>
+                <w:strike w:val="0"/>
+                <w:color w:val="000000"/>
+                <w:sz w:val="22"/>
+                <w:szCs w:val="22"/>
+                <w:u w:val="none"/>
+                <w:shd w:fill="auto" w:val="clear"/>
+                <w:vertAlign w:val="baseline"/>
+                <w:rtl w:val="0"/>
+              </w:rPr>
+              <w:t xml:space="preserve">Remover/Apagar pasta</w:t>
+              <w:tab/>
+              <w:t xml:space="preserve">7</w:t>
+            </w:r>
+          </w:hyperlink>
+          <w:r>
+            <w:rPr>
+              <w:rtl w:val="0"/>
+            </w:rPr>
+          </w:r>
+        </w:p>
+        <w:p>
+          <w:pPr>
+            <w:widowControl w:val="0"/>
+            <w:tabs>
+              <w:tab w:val="right" w:leader="dot" w:pos="12000"/>
             </w:tabs>
             <w:spacing w:before="60" w:line="240" w:lineRule="auto"/>
             <w:rPr>
+              <w:rFonts w:ascii="Arial" w:cs="Arial" w:eastAsia="Arial" w:hAnsi="Arial"/>
               <w:b w:val="1"/>
               <w:bCs w:val="1"/>
+              <w:i w:val="0"/>
+              <w:iCs w:val="0"/>
+              <w:smallCaps w:val="0"/>
+              <w:strike w:val="0"/>
               <w:color w:val="000000"/>
+              <w:sz w:val="22"/>
+              <w:szCs w:val="22"/>
               <w:u w:val="none"/>
+              <w:shd w:fill="auto" w:val="clear"/>
+              <w:vertAlign w:val="baseline"/>
+            </w:rPr>
+          </w:pPr>
+          <w:hyperlink w:anchor="_idvqtrpkbirm">
+            <w:r>
+              <w:rPr>
+                <w:rFonts w:ascii="Arial" w:cs="Arial" w:eastAsia="Arial" w:hAnsi="Arial"/>
+                <w:b w:val="1"/>
+                <w:bCs w:val="1"/>
+                <w:i w:val="0"/>
+                <w:iCs w:val="0"/>
+                <w:smallCaps w:val="0"/>
+                <w:strike w:val="0"/>
+                <w:color w:val="000000"/>
+                <w:sz w:val="22"/>
+                <w:szCs w:val="22"/>
+                <w:u w:val="none"/>
+                <w:shd w:fill="auto" w:val="clear"/>
+                <w:vertAlign w:val="baseline"/>
+                <w:rtl w:val="0"/>
+              </w:rPr>
+              <w:t xml:space="preserve">Entendendo o Sudo</w:t>
+              <w:tab/>
+              <w:t xml:space="preserve">7</w:t>
+            </w:r>
+          </w:hyperlink>
+          <w:r>
+            <w:rPr>
+              <w:rtl w:val="0"/>
+            </w:rPr>
+          </w:r>
+        </w:p>
+        <w:p>
+          <w:pPr>
+            <w:widowControl w:val="0"/>
+            <w:tabs>
+              <w:tab w:val="right" w:leader="dot" w:pos="12000"/>
+            </w:tabs>
+            <w:spacing w:before="60" w:line="240" w:lineRule="auto"/>
+            <w:ind w:left="360" w:firstLine="0"/>
+            <w:rPr>
+              <w:rFonts w:ascii="Arial" w:cs="Arial" w:eastAsia="Arial" w:hAnsi="Arial"/>
+              <w:b w:val="0"/>
+              <w:bCs w:val="0"/>
+              <w:i w:val="0"/>
+              <w:iCs w:val="0"/>
+              <w:smallCaps w:val="0"/>
+              <w:strike w:val="0"/>
+              <w:color w:val="000000"/>
+              <w:sz w:val="22"/>
+              <w:szCs w:val="22"/>
+              <w:u w:val="none"/>
+              <w:shd w:fill="auto" w:val="clear"/>
+              <w:vertAlign w:val="baseline"/>
+            </w:rPr>
+          </w:pPr>
+          <w:hyperlink w:anchor="_5axrso3pwsyc">
+            <w:r>
+              <w:rPr>
+                <w:rFonts w:ascii="Arial" w:cs="Arial" w:eastAsia="Arial" w:hAnsi="Arial"/>
+                <w:b w:val="0"/>
+                <w:bCs w:val="0"/>
+                <w:i w:val="0"/>
+                <w:iCs w:val="0"/>
+                <w:smallCaps w:val="0"/>
+                <w:strike w:val="0"/>
+                <w:color w:val="000000"/>
+                <w:sz w:val="22"/>
+                <w:szCs w:val="22"/>
+                <w:u w:val="none"/>
+                <w:shd w:fill="auto" w:val="clear"/>
+                <w:vertAlign w:val="baseline"/>
+                <w:rtl w:val="0"/>
+              </w:rPr>
+              <w:t xml:space="preserve">Sudo su</w:t>
+              <w:tab/>
+              <w:t xml:space="preserve">8</w:t>
+            </w:r>
+          </w:hyperlink>
+          <w:r>
+            <w:rPr>
+              <w:rtl w:val="0"/>
+            </w:rPr>
+          </w:r>
+        </w:p>
+        <w:p>
+          <w:pPr>
+            <w:widowControl w:val="0"/>
+            <w:tabs>
+              <w:tab w:val="right" w:leader="dot" w:pos="12000"/>
+            </w:tabs>
+            <w:spacing w:before="60" w:line="240" w:lineRule="auto"/>
+            <w:rPr>
+              <w:rFonts w:ascii="Arial" w:cs="Arial" w:eastAsia="Arial" w:hAnsi="Arial"/>
+              <w:b w:val="1"/>
+              <w:bCs w:val="1"/>
+              <w:i w:val="0"/>
+              <w:iCs w:val="0"/>
+              <w:smallCaps w:val="0"/>
+              <w:strike w:val="0"/>
+              <w:color w:val="000000"/>
+              <w:sz w:val="22"/>
+              <w:szCs w:val="22"/>
+              <w:u w:val="none"/>
+              <w:shd w:fill="auto" w:val="clear"/>
+              <w:vertAlign w:val="baseline"/>
+            </w:rPr>
+          </w:pPr>
+          <w:hyperlink w:anchor="_ehp3d3tg07">
+            <w:r>
+              <w:rPr>
+                <w:rFonts w:ascii="Arial" w:cs="Arial" w:eastAsia="Arial" w:hAnsi="Arial"/>
+                <w:b w:val="1"/>
+                <w:bCs w:val="1"/>
+                <w:i w:val="0"/>
+                <w:iCs w:val="0"/>
+                <w:smallCaps w:val="0"/>
+                <w:strike w:val="0"/>
+                <w:color w:val="000000"/>
+                <w:sz w:val="22"/>
+                <w:szCs w:val="22"/>
+                <w:u w:val="none"/>
+                <w:shd w:fill="auto" w:val="clear"/>
+                <w:vertAlign w:val="baseline"/>
+                <w:rtl w:val="0"/>
+              </w:rPr>
+              <w:t xml:space="preserve">Atualizando Pacotes do Sistema</w:t>
+              <w:tab/>
+              <w:t xml:space="preserve">8</w:t>
+            </w:r>
+          </w:hyperlink>
+          <w:r>
+            <w:rPr>
+              <w:rtl w:val="0"/>
+            </w:rPr>
+          </w:r>
+        </w:p>
+        <w:p>
+          <w:pPr>
+            <w:widowControl w:val="0"/>
+            <w:tabs>
+              <w:tab w:val="right" w:leader="dot" w:pos="12000"/>
+            </w:tabs>
+            <w:spacing w:before="60" w:line="240" w:lineRule="auto"/>
+            <w:ind w:left="360" w:firstLine="0"/>
+            <w:rPr>
+              <w:rFonts w:ascii="Arial" w:cs="Arial" w:eastAsia="Arial" w:hAnsi="Arial"/>
+              <w:b w:val="0"/>
+              <w:bCs w:val="0"/>
+              <w:i w:val="0"/>
+              <w:iCs w:val="0"/>
+              <w:smallCaps w:val="0"/>
+              <w:strike w:val="0"/>
+              <w:color w:val="000000"/>
+              <w:sz w:val="22"/>
+              <w:szCs w:val="22"/>
+              <w:u w:val="none"/>
+              <w:shd w:fill="auto" w:val="clear"/>
+              <w:vertAlign w:val="baseline"/>
+            </w:rPr>
+          </w:pPr>
+          <w:hyperlink w:anchor="_dg9xypyug62z">
+            <w:r>
+              <w:rPr>
+                <w:rFonts w:ascii="Arial" w:cs="Arial" w:eastAsia="Arial" w:hAnsi="Arial"/>
+                <w:b w:val="0"/>
+                <w:bCs w:val="0"/>
+                <w:i w:val="0"/>
+                <w:iCs w:val="0"/>
+                <w:smallCaps w:val="0"/>
+                <w:strike w:val="0"/>
+                <w:color w:val="000000"/>
+                <w:sz w:val="22"/>
+                <w:szCs w:val="22"/>
+                <w:u w:val="none"/>
+                <w:shd w:fill="auto" w:val="clear"/>
+                <w:vertAlign w:val="baseline"/>
+                <w:rtl w:val="0"/>
+              </w:rPr>
+              <w:t xml:space="preserve">O update</w:t>
+              <w:tab/>
+              <w:t xml:space="preserve">8</w:t>
+            </w:r>
+          </w:hyperlink>
+          <w:r>
+            <w:rPr>
+              <w:rtl w:val="0"/>
+            </w:rPr>
+          </w:r>
+        </w:p>
+        <w:p>
+          <w:pPr>
+            <w:widowControl w:val="0"/>
+            <w:tabs>
+              <w:tab w:val="right" w:leader="dot" w:pos="12000"/>
+            </w:tabs>
+            <w:spacing w:before="60" w:line="240" w:lineRule="auto"/>
+            <w:ind w:left="360" w:firstLine="0"/>
+            <w:rPr>
+              <w:rFonts w:ascii="Arial" w:cs="Arial" w:eastAsia="Arial" w:hAnsi="Arial"/>
+              <w:b w:val="0"/>
+              <w:bCs w:val="0"/>
+              <w:i w:val="0"/>
+              <w:iCs w:val="0"/>
+              <w:smallCaps w:val="0"/>
+              <w:strike w:val="0"/>
+              <w:color w:val="000000"/>
+              <w:sz w:val="22"/>
+              <w:szCs w:val="22"/>
+              <w:u w:val="none"/>
+              <w:shd w:fill="auto" w:val="clear"/>
+              <w:vertAlign w:val="baseline"/>
+            </w:rPr>
+          </w:pPr>
+          <w:hyperlink w:anchor="_xygqdvlu2hcz">
+            <w:r>
+              <w:rPr>
+                <w:rFonts w:ascii="Arial" w:cs="Arial" w:eastAsia="Arial" w:hAnsi="Arial"/>
+                <w:b w:val="0"/>
+                <w:bCs w:val="0"/>
+                <w:i w:val="0"/>
+                <w:iCs w:val="0"/>
+                <w:smallCaps w:val="0"/>
+                <w:strike w:val="0"/>
+                <w:color w:val="000000"/>
+                <w:sz w:val="22"/>
+                <w:szCs w:val="22"/>
+                <w:u w:val="none"/>
+                <w:shd w:fill="auto" w:val="clear"/>
+                <w:vertAlign w:val="baseline"/>
+                <w:rtl w:val="0"/>
+              </w:rPr>
+              <w:t xml:space="preserve">O upgrade</w:t>
+              <w:tab/>
+              <w:t xml:space="preserve">8</w:t>
+            </w:r>
+          </w:hyperlink>
+          <w:r>
+            <w:rPr>
+              <w:rtl w:val="0"/>
+            </w:rPr>
+          </w:r>
+        </w:p>
+        <w:p>
+          <w:pPr>
+            <w:widowControl w:val="0"/>
+            <w:tabs>
+              <w:tab w:val="right" w:leader="dot" w:pos="12000"/>
+            </w:tabs>
+            <w:spacing w:before="60" w:line="240" w:lineRule="auto"/>
+            <w:ind w:left="360" w:firstLine="0"/>
+            <w:rPr>
+              <w:rFonts w:ascii="Arial" w:cs="Arial" w:eastAsia="Arial" w:hAnsi="Arial"/>
+              <w:b w:val="0"/>
+              <w:bCs w:val="0"/>
+              <w:i w:val="0"/>
+              <w:iCs w:val="0"/>
+              <w:smallCaps w:val="0"/>
+              <w:strike w:val="0"/>
+              <w:color w:val="000000"/>
+              <w:sz w:val="22"/>
+              <w:szCs w:val="22"/>
+              <w:u w:val="none"/>
+              <w:shd w:fill="auto" w:val="clear"/>
+              <w:vertAlign w:val="baseline"/>
+            </w:rPr>
+          </w:pPr>
+          <w:hyperlink w:anchor="_k0p04tus90nt">
+            <w:r>
+              <w:rPr>
+                <w:rFonts w:ascii="Arial" w:cs="Arial" w:eastAsia="Arial" w:hAnsi="Arial"/>
+                <w:b w:val="0"/>
+                <w:bCs w:val="0"/>
+                <w:i w:val="0"/>
+                <w:iCs w:val="0"/>
+                <w:smallCaps w:val="0"/>
+                <w:strike w:val="0"/>
+                <w:color w:val="000000"/>
+                <w:sz w:val="22"/>
+                <w:szCs w:val="22"/>
+                <w:u w:val="none"/>
+                <w:shd w:fill="auto" w:val="clear"/>
+                <w:vertAlign w:val="baseline"/>
+                <w:rtl w:val="0"/>
+              </w:rPr>
+              <w:t xml:space="preserve">O autoremove</w:t>
+              <w:tab/>
+              <w:t xml:space="preserve">8</w:t>
+            </w:r>
+          </w:hyperlink>
+          <w:r>
+            <w:rPr>
+              <w:rtl w:val="0"/>
+            </w:rPr>
+          </w:r>
+        </w:p>
+        <w:p>
+          <w:pPr>
+            <w:widowControl w:val="0"/>
+            <w:tabs>
+              <w:tab w:val="right" w:leader="dot" w:pos="12000"/>
+            </w:tabs>
+            <w:spacing w:before="60" w:line="240" w:lineRule="auto"/>
+            <w:rPr>
+              <w:rFonts w:ascii="Arial" w:cs="Arial" w:eastAsia="Arial" w:hAnsi="Arial"/>
+              <w:b w:val="1"/>
+              <w:bCs w:val="1"/>
+              <w:i w:val="0"/>
+              <w:iCs w:val="0"/>
+              <w:smallCaps w:val="0"/>
+              <w:strike w:val="0"/>
+              <w:color w:val="000000"/>
+              <w:sz w:val="22"/>
+              <w:szCs w:val="22"/>
+              <w:u w:val="none"/>
+              <w:shd w:fill="auto" w:val="clear"/>
+              <w:vertAlign w:val="baseline"/>
+            </w:rPr>
+          </w:pPr>
+          <w:hyperlink w:anchor="_f42wb26veks6">
+            <w:r>
+              <w:rPr>
+                <w:rFonts w:ascii="Arial" w:cs="Arial" w:eastAsia="Arial" w:hAnsi="Arial"/>
+                <w:b w:val="1"/>
+                <w:bCs w:val="1"/>
+                <w:i w:val="0"/>
+                <w:iCs w:val="0"/>
+                <w:smallCaps w:val="0"/>
+                <w:strike w:val="0"/>
+                <w:color w:val="000000"/>
+                <w:sz w:val="22"/>
+                <w:szCs w:val="22"/>
+                <w:u w:val="none"/>
+                <w:shd w:fill="auto" w:val="clear"/>
+                <w:vertAlign w:val="baseline"/>
+                <w:rtl w:val="0"/>
+              </w:rPr>
+              <w:t xml:space="preserve">Instalando Softwares</w:t>
+              <w:tab/>
+              <w:t xml:space="preserve">9</w:t>
+            </w:r>
+          </w:hyperlink>
+          <w:r>
+            <w:rPr>
+              <w:rtl w:val="0"/>
+            </w:rPr>
+          </w:r>
+        </w:p>
+        <w:p>
+          <w:pPr>
+            <w:widowControl w:val="0"/>
+            <w:tabs>
+              <w:tab w:val="right" w:leader="dot" w:pos="12000"/>
+            </w:tabs>
+            <w:spacing w:before="60" w:line="240" w:lineRule="auto"/>
+            <w:ind w:left="360" w:firstLine="0"/>
+            <w:rPr>
+              <w:rFonts w:ascii="Arial" w:cs="Arial" w:eastAsia="Arial" w:hAnsi="Arial"/>
+              <w:b w:val="0"/>
+              <w:bCs w:val="0"/>
+              <w:i w:val="0"/>
+              <w:iCs w:val="0"/>
+              <w:smallCaps w:val="0"/>
+              <w:strike w:val="0"/>
+              <w:color w:val="000000"/>
+              <w:sz w:val="22"/>
+              <w:szCs w:val="22"/>
+              <w:u w:val="none"/>
+              <w:shd w:fill="auto" w:val="clear"/>
+              <w:vertAlign w:val="baseline"/>
+            </w:rPr>
+          </w:pPr>
+          <w:hyperlink w:anchor="_z756nz7e9pwj">
+            <w:r>
+              <w:rPr>
+                <w:rFonts w:ascii="Arial" w:cs="Arial" w:eastAsia="Arial" w:hAnsi="Arial"/>
+                <w:b w:val="0"/>
+                <w:bCs w:val="0"/>
+                <w:i w:val="0"/>
+                <w:iCs w:val="0"/>
+                <w:smallCaps w:val="0"/>
+                <w:strike w:val="0"/>
+                <w:color w:val="000000"/>
+                <w:sz w:val="22"/>
+                <w:szCs w:val="22"/>
+                <w:u w:val="none"/>
+                <w:shd w:fill="auto" w:val="clear"/>
+                <w:vertAlign w:val="baseline"/>
+                <w:rtl w:val="0"/>
+              </w:rPr>
+              <w:t xml:space="preserve">O apt install</w:t>
+              <w:tab/>
+              <w:t xml:space="preserve">9</w:t>
+            </w:r>
+          </w:hyperlink>
+          <w:r>
+            <w:rPr>
+              <w:rtl w:val="0"/>
+            </w:rPr>
+          </w:r>
+        </w:p>
+        <w:p>
+          <w:pPr>
+            <w:widowControl w:val="0"/>
+            <w:tabs>
+              <w:tab w:val="right" w:leader="dot" w:pos="12000"/>
+            </w:tabs>
+            <w:spacing w:before="60" w:line="240" w:lineRule="auto"/>
+            <w:rPr>
+              <w:rFonts w:ascii="Arial" w:cs="Arial" w:eastAsia="Arial" w:hAnsi="Arial"/>
+              <w:b w:val="1"/>
+              <w:bCs w:val="1"/>
+              <w:i w:val="0"/>
+              <w:iCs w:val="0"/>
+              <w:smallCaps w:val="0"/>
+              <w:strike w:val="0"/>
+              <w:color w:val="000000"/>
+              <w:sz w:val="22"/>
+              <w:szCs w:val="22"/>
+              <w:u w:val="none"/>
+              <w:shd w:fill="auto" w:val="clear"/>
+              <w:vertAlign w:val="baseline"/>
+            </w:rPr>
+          </w:pPr>
+          <w:hyperlink w:anchor="_41zb618drwsd">
+            <w:r>
+              <w:rPr>
+                <w:rFonts w:ascii="Arial" w:cs="Arial" w:eastAsia="Arial" w:hAnsi="Arial"/>
+                <w:b w:val="1"/>
+                <w:bCs w:val="1"/>
+                <w:i w:val="0"/>
+                <w:iCs w:val="0"/>
+                <w:smallCaps w:val="0"/>
+                <w:strike w:val="0"/>
+                <w:color w:val="000000"/>
+                <w:sz w:val="22"/>
+                <w:szCs w:val="22"/>
+                <w:u w:val="none"/>
+                <w:shd w:fill="auto" w:val="clear"/>
+                <w:vertAlign w:val="baseline"/>
+                <w:rtl w:val="0"/>
+              </w:rPr>
+              <w:t xml:space="preserve">Editores de Texto no Terminal</w:t>
+              <w:tab/>
+              <w:t xml:space="preserve">9</w:t>
+            </w:r>
+          </w:hyperlink>
+          <w:r>
+            <w:rPr>
+              <w:rtl w:val="0"/>
+            </w:rPr>
+          </w:r>
+        </w:p>
+        <w:p>
+          <w:pPr>
+            <w:widowControl w:val="0"/>
+            <w:tabs>
+              <w:tab w:val="right" w:leader="dot" w:pos="12000"/>
+            </w:tabs>
+            <w:spacing w:before="60" w:line="240" w:lineRule="auto"/>
+            <w:ind w:left="360" w:firstLine="0"/>
+            <w:rPr>
+              <w:rFonts w:ascii="Arial" w:cs="Arial" w:eastAsia="Arial" w:hAnsi="Arial"/>
+              <w:b w:val="0"/>
+              <w:bCs w:val="0"/>
+              <w:i w:val="0"/>
+              <w:iCs w:val="0"/>
+              <w:smallCaps w:val="0"/>
+              <w:strike w:val="0"/>
+              <w:color w:val="000000"/>
+              <w:sz w:val="22"/>
+              <w:szCs w:val="22"/>
+              <w:u w:val="none"/>
+              <w:shd w:fill="auto" w:val="clear"/>
+              <w:vertAlign w:val="baseline"/>
+            </w:rPr>
+          </w:pPr>
+          <w:hyperlink w:anchor="_m662ufqzh7ul">
+            <w:r>
+              <w:rPr>
+                <w:rFonts w:ascii="Arial" w:cs="Arial" w:eastAsia="Arial" w:hAnsi="Arial"/>
+                <w:b w:val="0"/>
+                <w:bCs w:val="0"/>
+                <w:i w:val="0"/>
+                <w:iCs w:val="0"/>
+                <w:smallCaps w:val="0"/>
+                <w:strike w:val="0"/>
+                <w:color w:val="000000"/>
+                <w:sz w:val="22"/>
+                <w:szCs w:val="22"/>
+                <w:u w:val="none"/>
+                <w:shd w:fill="auto" w:val="clear"/>
+                <w:vertAlign w:val="baseline"/>
+                <w:rtl w:val="0"/>
+              </w:rPr>
+              <w:t xml:space="preserve">Nano</w:t>
+              <w:tab/>
+              <w:t xml:space="preserve">9</w:t>
+            </w:r>
+          </w:hyperlink>
+          <w:r>
+            <w:rPr>
+              <w:rtl w:val="0"/>
+            </w:rPr>
+          </w:r>
+        </w:p>
+        <w:p>
+          <w:pPr>
+            <w:widowControl w:val="0"/>
+            <w:tabs>
+              <w:tab w:val="right" w:leader="dot" w:pos="12000"/>
+            </w:tabs>
+            <w:spacing w:before="60" w:line="240" w:lineRule="auto"/>
+            <w:ind w:left="360" w:firstLine="0"/>
+            <w:rPr>
+              <w:rFonts w:ascii="Arial" w:cs="Arial" w:eastAsia="Arial" w:hAnsi="Arial"/>
+              <w:b w:val="0"/>
+              <w:bCs w:val="0"/>
+              <w:i w:val="0"/>
+              <w:iCs w:val="0"/>
+              <w:smallCaps w:val="0"/>
+              <w:strike w:val="0"/>
+              <w:color w:val="000000"/>
+              <w:sz w:val="22"/>
+              <w:szCs w:val="22"/>
+              <w:u w:val="none"/>
+              <w:shd w:fill="auto" w:val="clear"/>
+              <w:vertAlign w:val="baseline"/>
+            </w:rPr>
+          </w:pPr>
+          <w:hyperlink w:anchor="_emm90hbab6er">
+            <w:r>
+              <w:rPr>
+                <w:rFonts w:ascii="Arial" w:cs="Arial" w:eastAsia="Arial" w:hAnsi="Arial"/>
+                <w:b w:val="0"/>
+                <w:bCs w:val="0"/>
+                <w:i w:val="0"/>
+                <w:iCs w:val="0"/>
+                <w:smallCaps w:val="0"/>
+                <w:strike w:val="0"/>
+                <w:color w:val="000000"/>
+                <w:sz w:val="22"/>
+                <w:szCs w:val="22"/>
+                <w:u w:val="none"/>
+                <w:shd w:fill="auto" w:val="clear"/>
+                <w:vertAlign w:val="baseline"/>
+                <w:rtl w:val="0"/>
+              </w:rPr>
+              <w:t xml:space="preserve">Vim</w:t>
+              <w:tab/>
+              <w:t xml:space="preserve">11</w:t>
+            </w:r>
+          </w:hyperlink>
+          <w:r>
+            <w:rPr>
+              <w:rtl w:val="0"/>
+            </w:rPr>
+          </w:r>
+        </w:p>
+        <w:p>
+          <w:pPr>
+            <w:widowControl w:val="0"/>
+            <w:tabs>
+              <w:tab w:val="right" w:leader="dot" w:pos="12000"/>
+            </w:tabs>
+            <w:spacing w:before="60" w:line="240" w:lineRule="auto"/>
+            <w:rPr>
+              <w:rFonts w:ascii="Arial" w:cs="Arial" w:eastAsia="Arial" w:hAnsi="Arial"/>
+              <w:b w:val="1"/>
+              <w:bCs w:val="1"/>
+              <w:i w:val="0"/>
+              <w:iCs w:val="0"/>
+              <w:smallCaps w:val="0"/>
+              <w:strike w:val="0"/>
+              <w:color w:val="000000"/>
+              <w:sz w:val="22"/>
+              <w:szCs w:val="22"/>
+              <w:u w:val="none"/>
+              <w:shd w:fill="auto" w:val="clear"/>
+              <w:vertAlign w:val="baseline"/>
+            </w:rPr>
+          </w:pPr>
+          <w:hyperlink w:anchor="_7irprxdr4ezl">
+            <w:r>
+              <w:rPr>
+                <w:rFonts w:ascii="Arial" w:cs="Arial" w:eastAsia="Arial" w:hAnsi="Arial"/>
+                <w:b w:val="1"/>
+                <w:bCs w:val="1"/>
+                <w:i w:val="0"/>
+                <w:iCs w:val="0"/>
+                <w:smallCaps w:val="0"/>
+                <w:strike w:val="0"/>
+                <w:color w:val="000000"/>
+                <w:sz w:val="22"/>
+                <w:szCs w:val="22"/>
+                <w:u w:val="none"/>
+                <w:shd w:fill="auto" w:val="clear"/>
+                <w:vertAlign w:val="baseline"/>
+                <w:rtl w:val="0"/>
+              </w:rPr>
+              <w:t xml:space="preserve">Atualizando Aplicativos pelo Terminal</w:t>
+              <w:tab/>
+              <w:t xml:space="preserve">13</w:t>
+            </w:r>
+          </w:hyperlink>
+          <w:r>
+            <w:rPr>
+              <w:rtl w:val="0"/>
+            </w:rPr>
+          </w:r>
+        </w:p>
+        <w:p>
+          <w:pPr>
+            <w:widowControl w:val="0"/>
+            <w:tabs>
+              <w:tab w:val="right" w:leader="dot" w:pos="12000"/>
+            </w:tabs>
+            <w:spacing w:before="60" w:line="240" w:lineRule="auto"/>
+            <w:rPr>
+              <w:rFonts w:ascii="Arial" w:cs="Arial" w:eastAsia="Arial" w:hAnsi="Arial"/>
+              <w:b w:val="1"/>
+              <w:bCs w:val="1"/>
+              <w:i w:val="0"/>
+              <w:iCs w:val="0"/>
+              <w:smallCaps w:val="0"/>
+              <w:strike w:val="0"/>
+              <w:color w:val="000000"/>
+              <w:sz w:val="22"/>
+              <w:szCs w:val="22"/>
+              <w:u w:val="none"/>
+              <w:shd w:fill="auto" w:val="clear"/>
+              <w:vertAlign w:val="baseline"/>
+            </w:rPr>
+          </w:pPr>
+          <w:hyperlink w:anchor="_3uv23dmq0rkn">
+            <w:r>
+              <w:rPr>
+                <w:rFonts w:ascii="Arial" w:cs="Arial" w:eastAsia="Arial" w:hAnsi="Arial"/>
+                <w:b w:val="1"/>
+                <w:bCs w:val="1"/>
+                <w:i w:val="0"/>
+                <w:iCs w:val="0"/>
+                <w:smallCaps w:val="0"/>
+                <w:strike w:val="0"/>
+                <w:color w:val="000000"/>
+                <w:sz w:val="22"/>
+                <w:szCs w:val="22"/>
+                <w:u w:val="none"/>
+                <w:shd w:fill="auto" w:val="clear"/>
+                <w:vertAlign w:val="baseline"/>
+                <w:rtl w:val="0"/>
+              </w:rPr>
+              <w:t xml:space="preserve">Criando Aliases (Apelidos)</w:t>
+              <w:tab/>
+              <w:t xml:space="preserve">13</w:t>
+            </w:r>
+          </w:hyperlink>
+          <w:r>
+            <w:rPr>
+              <w:rtl w:val="0"/>
+            </w:rPr>
+          </w:r>
+        </w:p>
+        <w:p>
+          <w:pPr>
+            <w:widowControl w:val="0"/>
+            <w:tabs>
+              <w:tab w:val="right" w:leader="dot" w:pos="12000"/>
+            </w:tabs>
+            <w:spacing w:before="60" w:line="240" w:lineRule="auto"/>
+            <w:rPr>
+              <w:rFonts w:ascii="Arial" w:cs="Arial" w:eastAsia="Arial" w:hAnsi="Arial"/>
+              <w:b w:val="1"/>
+              <w:bCs w:val="1"/>
+              <w:i w:val="0"/>
+              <w:iCs w:val="0"/>
+              <w:smallCaps w:val="0"/>
+              <w:strike w:val="0"/>
+              <w:color w:val="000000"/>
+              <w:sz w:val="22"/>
+              <w:szCs w:val="22"/>
+              <w:u w:val="none"/>
+              <w:shd w:fill="auto" w:val="clear"/>
+              <w:vertAlign w:val="baseline"/>
             </w:rPr>
           </w:pPr>
           <w:hyperlink w:anchor="_egs82eygp3yy">
             <w:r>
               <w:rPr>
+                <w:rFonts w:ascii="Arial" w:cs="Arial" w:eastAsia="Arial" w:hAnsi="Arial"/>
                 <w:b w:val="1"/>
                 <w:bCs w:val="1"/>
+                <w:i w:val="0"/>
+                <w:iCs w:val="0"/>
+                <w:smallCaps w:val="0"/>
+                <w:strike w:val="0"/>
                 <w:color w:val="000000"/>
+                <w:sz w:val="22"/>
+                <w:szCs w:val="22"/>
                 <w:u w:val="none"/>
+                <w:shd w:fill="auto" w:val="clear"/>
+                <w:vertAlign w:val="baseline"/>
                 <w:rtl w:val="0"/>
               </w:rPr>
               <w:t xml:space="preserve">Personalizando o Terminal</w:t>
               <w:tab/>
+              <w:t xml:space="preserve">14</w:t>
             </w:r>
           </w:hyperlink>
           <w:r>
-            <w:fldChar w:fldCharType="begin"/>
-            <w:instrText xml:space="preserve"> PAGEREF _egs82eygp3yy \h </w:instrText>
-            <w:fldChar w:fldCharType="separate"/>
-          </w:r>
-          <w:r>
             <w:rPr>
-              <w:b w:val="1"/>
-              <w:bCs w:val="1"/>
               <w:rtl w:val="0"/>
             </w:rPr>
-            <w:t xml:space="preserve">14</w:t>
           </w:r>
-          <w:r>
-            <w:fldChar w:fldCharType="end"/>
-          </w:r>
+        </w:p>
+        <w:p>
+          <w:pPr>
+            <w:widowControl w:val="0"/>
+            <w:tabs>
+              <w:tab w:val="right" w:leader="dot" w:pos="12000"/>
+            </w:tabs>
+            <w:spacing w:before="60" w:line="240" w:lineRule="auto"/>
+            <w:ind w:left="360" w:firstLine="0"/>
+            <w:rPr>
+              <w:rFonts w:ascii="Arial" w:cs="Arial" w:eastAsia="Arial" w:hAnsi="Arial"/>
+              <w:b w:val="0"/>
+              <w:bCs w:val="0"/>
+              <w:i w:val="0"/>
+              <w:iCs w:val="0"/>
+              <w:smallCaps w:val="0"/>
+              <w:strike w:val="0"/>
+              <w:color w:val="000000"/>
+              <w:sz w:val="22"/>
+              <w:szCs w:val="22"/>
+              <w:u w:val="none"/>
+              <w:shd w:fill="auto" w:val="clear"/>
+              <w:vertAlign w:val="baseline"/>
+            </w:rPr>
+          </w:pPr>
+          <w:hyperlink w:anchor="_rn9m1ykfl3wd">
+            <w:r>
+              <w:rPr>
+                <w:rFonts w:ascii="Arial" w:cs="Arial" w:eastAsia="Arial" w:hAnsi="Arial"/>
+                <w:b w:val="0"/>
+                <w:bCs w:val="0"/>
+                <w:i w:val="0"/>
+                <w:iCs w:val="0"/>
+                <w:smallCaps w:val="0"/>
+                <w:strike w:val="0"/>
+                <w:color w:val="000000"/>
+                <w:sz w:val="22"/>
+                <w:szCs w:val="22"/>
+                <w:u w:val="none"/>
+                <w:shd w:fill="auto" w:val="clear"/>
+                <w:vertAlign w:val="baseline"/>
+                <w:rtl w:val="0"/>
+              </w:rPr>
+              <w:t xml:space="preserve">Terminal Integrado VSCode</w:t>
+              <w:tab/>
+              <w:t xml:space="preserve">15</w:t>
+            </w:r>
+          </w:hyperlink>
           <w:r>
             <w:rPr>
               <w:rtl w:val="0"/>
@@ -793,7 +1789,7 @@
     </w:p>
     <w:p>
       <w:pPr>
-        <w:pStyle w:val="Subtitle"/>
+        <w:pStyle w:val="Heading2"/>
         <w:rPr/>
       </w:pPr>
       <w:bookmarkStart w:colFirst="0" w:colLast="0" w:name="_hrpsrxtx0hai" w:id="7"/>
@@ -802,8 +1798,6 @@
         <w:rPr>
           <w:rtl w:val="0"/>
         </w:rPr>
-        <w:br w:type="textWrapping"/>
-        <w:br w:type="textWrapping"/>
         <w:t xml:space="preserve">O que é um diretório?</w:t>
       </w:r>
     </w:p>
@@ -1166,7 +2160,7 @@
     </w:p>
     <w:p>
       <w:pPr>
-        <w:pStyle w:val="Subtitle"/>
+        <w:pStyle w:val="Heading2"/>
         <w:rPr/>
       </w:pPr>
       <w:bookmarkStart w:colFirst="0" w:colLast="0" w:name="_vmtayzdxbwu9" w:id="9"/>
@@ -1338,7 +2332,7 @@
     </w:p>
     <w:p>
       <w:pPr>
-        <w:pStyle w:val="Subtitle"/>
+        <w:pStyle w:val="Heading2"/>
         <w:rPr/>
       </w:pPr>
       <w:bookmarkStart w:colFirst="0" w:colLast="0" w:name="_7umjpmq4ehzx" w:id="10"/>
@@ -1397,7 +2391,7 @@
     </w:p>
     <w:p>
       <w:pPr>
-        <w:pStyle w:val="Subtitle"/>
+        <w:pStyle w:val="Heading2"/>
         <w:rPr/>
       </w:pPr>
       <w:bookmarkStart w:colFirst="0" w:colLast="0" w:name="_c7eyj9d97243" w:id="11"/>
@@ -1561,13 +2555,8 @@
     </w:p>
     <w:p>
       <w:pPr>
-        <w:pStyle w:val="Subtitle"/>
-        <w:rPr>
-          <w:rFonts w:ascii="Roboto Mono" w:cs="Roboto Mono" w:eastAsia="Roboto Mono" w:hAnsi="Roboto Mono"/>
-          <w:color w:val="188038"/>
-          <w:sz w:val="28"/>
-          <w:szCs w:val="28"/>
-        </w:rPr>
+        <w:pStyle w:val="Heading2"/>
+        <w:rPr/>
       </w:pPr>
       <w:bookmarkStart w:colFirst="0" w:colLast="0" w:name="_5nnhc9g8doy0" w:id="13"/>
       <w:bookmarkEnd w:id="13"/>
@@ -1577,11 +2566,6 @@
         </w:rPr>
         <w:t xml:space="preserve">Acessar pastas/diretórios</w:t>
       </w:r>
-      <w:r>
-        <w:rPr>
-          <w:rtl w:val="0"/>
-        </w:rPr>
-      </w:r>
     </w:p>
     <w:p>
       <w:pPr>
@@ -1901,6 +2885,8 @@
     <w:p>
       <w:pPr>
         <w:rPr>
+          <w:rFonts w:ascii="Roboto Mono" w:cs="Roboto Mono" w:eastAsia="Roboto Mono" w:hAnsi="Roboto Mono"/>
+          <w:color w:val="188038"/>
           <w:sz w:val="28"/>
           <w:szCs w:val="28"/>
         </w:rPr>
@@ -1915,28 +2901,154 @@
         </w:rPr>
         <w:t xml:space="preserve">cd ~</w:t>
       </w:r>
-      <w:r>
-        <w:rPr>
-          <w:rtl w:val="0"/>
-        </w:rPr>
-      </w:r>
-    </w:p>
-    <w:p>
-      <w:pPr>
-        <w:rPr>
-          <w:sz w:val="28"/>
-          <w:szCs w:val="28"/>
-        </w:rPr>
-      </w:pPr>
-      <w:r>
-        <w:rPr>
-          <w:rtl w:val="0"/>
-        </w:rPr>
-      </w:r>
-    </w:p>
-    <w:p>
-      <w:pPr>
-        <w:pStyle w:val="Subtitle"/>
+    </w:p>
+    <w:p>
+      <w:pPr>
+        <w:rPr>
+          <w:rFonts w:ascii="Roboto Mono" w:cs="Roboto Mono" w:eastAsia="Roboto Mono" w:hAnsi="Roboto Mono"/>
+          <w:color w:val="188038"/>
+          <w:sz w:val="28"/>
+          <w:szCs w:val="28"/>
+        </w:rPr>
+      </w:pPr>
+      <w:r>
+        <w:rPr>
+          <w:rtl w:val="0"/>
+        </w:rPr>
+      </w:r>
+    </w:p>
+    <w:p>
+      <w:pPr>
+        <w:rPr>
+          <w:sz w:val="28"/>
+          <w:szCs w:val="28"/>
+        </w:rPr>
+      </w:pPr>
+      <w:r>
+        <w:rPr>
+          <w:sz w:val="28"/>
+          <w:szCs w:val="28"/>
+          <w:rtl w:val="0"/>
+        </w:rPr>
+        <w:t xml:space="preserve">Caso queira voltar para um diretório que tenha acessado anteriormente sem ter que digitar a rota para esse diretório, use</w:t>
+      </w:r>
+    </w:p>
+    <w:p>
+      <w:pPr>
+        <w:rPr>
+          <w:sz w:val="28"/>
+          <w:szCs w:val="28"/>
+        </w:rPr>
+      </w:pPr>
+      <w:r>
+        <w:rPr>
+          <w:rFonts w:ascii="Roboto Mono" w:cs="Roboto Mono" w:eastAsia="Roboto Mono" w:hAnsi="Roboto Mono"/>
+          <w:color w:val="188038"/>
+          <w:sz w:val="28"/>
+          <w:szCs w:val="28"/>
+          <w:rtl w:val="0"/>
+        </w:rPr>
+        <w:t xml:space="preserve">cd -</w:t>
+      </w:r>
+      <w:r>
+        <w:rPr>
+          <w:rtl w:val="0"/>
+        </w:rPr>
+      </w:r>
+    </w:p>
+    <w:p>
+      <w:pPr>
+        <w:rPr>
+          <w:sz w:val="28"/>
+          <w:szCs w:val="28"/>
+        </w:rPr>
+      </w:pPr>
+      <w:r>
+        <w:rPr>
+          <w:b w:val="1"/>
+          <w:bCs w:val="1"/>
+          <w:sz w:val="28"/>
+          <w:szCs w:val="28"/>
+          <w:rtl w:val="0"/>
+        </w:rPr>
+        <w:t xml:space="preserve">Exemplo: </w:t>
+      </w:r>
+      <w:r>
+        <w:rPr>
+          <w:sz w:val="28"/>
+          <w:szCs w:val="28"/>
+          <w:rtl w:val="0"/>
+        </w:rPr>
+        <w:t xml:space="preserve">Acessou o diretório de Documentos (</w:t>
+      </w:r>
+      <w:r>
+        <w:rPr>
+          <w:rFonts w:ascii="Roboto Mono" w:cs="Roboto Mono" w:eastAsia="Roboto Mono" w:hAnsi="Roboto Mono"/>
+          <w:color w:val="188038"/>
+          <w:sz w:val="28"/>
+          <w:szCs w:val="28"/>
+          <w:rtl w:val="0"/>
+        </w:rPr>
+        <w:t xml:space="preserve">cd Documentos</w:t>
+      </w:r>
+      <w:r>
+        <w:rPr>
+          <w:sz w:val="28"/>
+          <w:szCs w:val="28"/>
+          <w:rtl w:val="0"/>
+        </w:rPr>
+        <w:t xml:space="preserve">), depois retornou e acessou Downloads (</w:t>
+      </w:r>
+      <w:r>
+        <w:rPr>
+          <w:rFonts w:ascii="Roboto Mono" w:cs="Roboto Mono" w:eastAsia="Roboto Mono" w:hAnsi="Roboto Mono"/>
+          <w:color w:val="188038"/>
+          <w:sz w:val="28"/>
+          <w:szCs w:val="28"/>
+          <w:rtl w:val="0"/>
+        </w:rPr>
+        <w:t xml:space="preserve">cd ../Downloads</w:t>
+      </w:r>
+      <w:r>
+        <w:rPr>
+          <w:sz w:val="28"/>
+          <w:szCs w:val="28"/>
+          <w:rtl w:val="0"/>
+        </w:rPr>
+        <w:t xml:space="preserve">) e deseja retornar para o diretório anterior (Documentos), basta usar </w:t>
+      </w:r>
+      <w:r>
+        <w:rPr>
+          <w:rFonts w:ascii="Roboto Mono" w:cs="Roboto Mono" w:eastAsia="Roboto Mono" w:hAnsi="Roboto Mono"/>
+          <w:color w:val="188038"/>
+          <w:sz w:val="28"/>
+          <w:szCs w:val="28"/>
+          <w:rtl w:val="0"/>
+        </w:rPr>
+        <w:t xml:space="preserve">cd -</w:t>
+      </w:r>
+      <w:r>
+        <w:rPr>
+          <w:rtl w:val="0"/>
+        </w:rPr>
+      </w:r>
+    </w:p>
+    <w:p>
+      <w:pPr>
+        <w:rPr>
+          <w:sz w:val="28"/>
+          <w:szCs w:val="28"/>
+        </w:rPr>
+      </w:pPr>
+      <w:r>
+        <w:rPr>
+          <w:rtl w:val="0"/>
+        </w:rPr>
+      </w:r>
+    </w:p>
+    <w:p>
+      <w:pPr>
+        <w:pStyle w:val="Heading2"/>
         <w:rPr>
           <w:rFonts w:ascii="Roboto Mono" w:cs="Roboto Mono" w:eastAsia="Roboto Mono" w:hAnsi="Roboto Mono"/>
           <w:color w:val="188038"/>
@@ -2357,7 +3469,7 @@
     </w:p>
     <w:p>
       <w:pPr>
-        <w:pStyle w:val="Subtitle"/>
+        <w:pStyle w:val="Heading2"/>
         <w:rPr/>
       </w:pPr>
       <w:bookmarkStart w:colFirst="0" w:colLast="0" w:name="_9ym5yusxxpot" w:id="15"/>
@@ -2459,7 +3571,7 @@
     </w:p>
     <w:p>
       <w:pPr>
-        <w:pStyle w:val="Subtitle"/>
+        <w:pStyle w:val="Heading2"/>
         <w:rPr/>
       </w:pPr>
       <w:bookmarkStart w:colFirst="0" w:colLast="0" w:name="_xv6oapry1fxr" w:id="16"/>
@@ -2531,7 +3643,7 @@
     </w:p>
     <w:p>
       <w:pPr>
-        <w:pStyle w:val="Subtitle"/>
+        <w:pStyle w:val="Heading2"/>
         <w:rPr/>
       </w:pPr>
       <w:bookmarkStart w:colFirst="0" w:colLast="0" w:name="_holdkliwkguo" w:id="17"/>
@@ -2778,7 +3890,7 @@
     </w:p>
     <w:p>
       <w:pPr>
-        <w:pStyle w:val="Subtitle"/>
+        <w:pStyle w:val="Heading2"/>
         <w:rPr/>
       </w:pPr>
       <w:bookmarkStart w:colFirst="0" w:colLast="0" w:name="_hpe1k73qqqyi" w:id="18"/>
@@ -2839,7 +3951,7 @@
     </w:p>
     <w:p>
       <w:pPr>
-        <w:pStyle w:val="Subtitle"/>
+        <w:pStyle w:val="Heading2"/>
         <w:rPr>
           <w:rFonts w:ascii="Roboto Mono" w:cs="Roboto Mono" w:eastAsia="Roboto Mono" w:hAnsi="Roboto Mono"/>
           <w:color w:val="188038"/>
@@ -2921,7 +4033,7 @@
     </w:p>
     <w:p>
       <w:pPr>
-        <w:pStyle w:val="Subtitle"/>
+        <w:pStyle w:val="Heading2"/>
         <w:rPr/>
       </w:pPr>
       <w:bookmarkStart w:colFirst="0" w:colLast="0" w:name="_fo2ns6j6dbyz" w:id="20"/>
@@ -3338,7 +4450,7 @@
     </w:p>
     <w:p>
       <w:pPr>
-        <w:pStyle w:val="Subtitle"/>
+        <w:pStyle w:val="Heading2"/>
         <w:rPr/>
       </w:pPr>
       <w:bookmarkStart w:colFirst="0" w:colLast="0" w:name="_5axrso3pwsyc" w:id="22"/>
@@ -3518,7 +4630,7 @@
     </w:p>
     <w:p>
       <w:pPr>
-        <w:pStyle w:val="Subtitle"/>
+        <w:pStyle w:val="Heading2"/>
         <w:rPr/>
       </w:pPr>
       <w:bookmarkStart w:colFirst="0" w:colLast="0" w:name="_dg9xypyug62z" w:id="24"/>
@@ -3596,7 +4708,7 @@
     </w:p>
     <w:p>
       <w:pPr>
-        <w:pStyle w:val="Subtitle"/>
+        <w:pStyle w:val="Heading2"/>
         <w:rPr/>
       </w:pPr>
       <w:bookmarkStart w:colFirst="0" w:colLast="0" w:name="_xygqdvlu2hcz" w:id="25"/>
@@ -3679,7 +4791,7 @@
     </w:p>
     <w:p>
       <w:pPr>
-        <w:pStyle w:val="Subtitle"/>
+        <w:pStyle w:val="Heading2"/>
         <w:rPr/>
       </w:pPr>
       <w:bookmarkStart w:colFirst="0" w:colLast="0" w:name="_k0p04tus90nt" w:id="26"/>
@@ -3772,7 +4884,7 @@
     </w:p>
     <w:p>
       <w:pPr>
-        <w:pStyle w:val="Subtitle"/>
+        <w:pStyle w:val="Heading2"/>
         <w:rPr/>
       </w:pPr>
       <w:bookmarkStart w:colFirst="0" w:colLast="0" w:name="_z756nz7e9pwj" w:id="28"/>
@@ -4175,12 +5287,12 @@
           <wp:inline distB="114300" distT="114300" distL="114300" distR="114300">
             <wp:extent cx="5731200" cy="2146300"/>
             <wp:effectExtent b="0" l="0" r="0" t="0"/>
-            <wp:docPr id="1" name="image3.png"/>
+            <wp:docPr id="1" name="image8.png"/>
             <a:graphic>
               <a:graphicData uri="http://schemas.openxmlformats.org/drawingml/2006/picture">
                 <pic:pic>
                   <pic:nvPicPr>
-                    <pic:cNvPr id="0" name="image3.png"/>
+                    <pic:cNvPr id="0" name="image8.png"/>
                     <pic:cNvPicPr preferRelativeResize="0"/>
                   </pic:nvPicPr>
                   <pic:blipFill>
@@ -4493,12 +5605,12 @@
           <wp:inline distB="114300" distT="114300" distL="114300" distR="114300">
             <wp:extent cx="5734050" cy="2049121"/>
             <wp:effectExtent b="0" l="0" r="0" t="0"/>
-            <wp:docPr id="7" name="image8.png"/>
+            <wp:docPr id="7" name="image3.png"/>
             <a:graphic>
               <a:graphicData uri="http://schemas.openxmlformats.org/drawingml/2006/picture">
                 <pic:pic>
                   <pic:nvPicPr>
-                    <pic:cNvPr id="0" name="image8.png"/>
+                    <pic:cNvPr id="0" name="image3.png"/>
                     <pic:cNvPicPr preferRelativeResize="0"/>
                   </pic:nvPicPr>
                   <pic:blipFill>
@@ -4901,12 +6013,12 @@
           <wp:inline distB="114300" distT="114300" distL="114300" distR="114300">
             <wp:extent cx="5731200" cy="1803400"/>
             <wp:effectExtent b="0" l="0" r="0" t="0"/>
-            <wp:docPr id="6" name="image5.png"/>
+            <wp:docPr id="6" name="image7.png"/>
             <a:graphic>
               <a:graphicData uri="http://schemas.openxmlformats.org/drawingml/2006/picture">
                 <pic:pic>
                   <pic:nvPicPr>
-                    <pic:cNvPr id="0" name="image5.png"/>
+                    <pic:cNvPr id="0" name="image7.png"/>
                     <pic:cNvPicPr preferRelativeResize="0"/>
                   </pic:nvPicPr>
                   <pic:blipFill>
@@ -5049,12 +6161,12 @@
           <wp:inline distB="114300" distT="114300" distL="114300" distR="114300">
             <wp:extent cx="5731200" cy="863600"/>
             <wp:effectExtent b="0" l="0" r="0" t="0"/>
-            <wp:docPr id="8" name="image7.png"/>
+            <wp:docPr id="8" name="image2.png"/>
             <a:graphic>
               <a:graphicData uri="http://schemas.openxmlformats.org/drawingml/2006/picture">
                 <pic:pic>
                   <pic:nvPicPr>
-                    <pic:cNvPr id="0" name="image7.png"/>
+                    <pic:cNvPr id="0" name="image2.png"/>
                     <pic:cNvPicPr preferRelativeResize="0"/>
                   </pic:nvPicPr>
                   <pic:blipFill>
@@ -5217,12 +6329,12 @@
           <wp:inline distB="114300" distT="114300" distL="114300" distR="114300">
             <wp:extent cx="4800600" cy="762000"/>
             <wp:effectExtent b="0" l="0" r="0" t="0"/>
-            <wp:docPr id="4" name="image1.png"/>
+            <wp:docPr id="4" name="image5.png"/>
             <a:graphic>
               <a:graphicData uri="http://schemas.openxmlformats.org/drawingml/2006/picture">
                 <pic:pic>
                   <pic:nvPicPr>
-                    <pic:cNvPr id="0" name="image1.png"/>
+                    <pic:cNvPr id="0" name="image5.png"/>
                     <pic:cNvPicPr preferRelativeResize="0"/>
                   </pic:nvPicPr>
                   <pic:blipFill>
@@ -5283,10 +6395,7 @@
     </w:p>
     <w:p>
       <w:pPr>
-        <w:rPr>
-          <w:sz w:val="28"/>
-          <w:szCs w:val="28"/>
-        </w:rPr>
+        <w:rPr/>
       </w:pPr>
       <w:r>
         <w:rPr>
@@ -5336,24 +6445,8 @@
         <w:pStyle w:val="Heading1"/>
         <w:rPr/>
       </w:pPr>
-      <w:bookmarkStart w:colFirst="0" w:colLast="0" w:name="_14b6s0yo70zu" w:id="38"/>
+      <w:bookmarkStart w:colFirst="0" w:colLast="0" w:name="_7irprxdr4ezl" w:id="38"/>
       <w:bookmarkEnd w:id="38"/>
-      <w:r>
-        <w:br w:type="page"/>
-      </w:r>
-      <w:r>
-        <w:rPr>
-          <w:rtl w:val="0"/>
-        </w:rPr>
-      </w:r>
-    </w:p>
-    <w:p>
-      <w:pPr>
-        <w:pStyle w:val="Heading1"/>
-        <w:rPr/>
-      </w:pPr>
-      <w:bookmarkStart w:colFirst="0" w:colLast="0" w:name="_7irprxdr4ezl" w:id="39"/>
-      <w:bookmarkEnd w:id="39"/>
       <w:r>
         <w:rPr>
           <w:rtl w:val="0"/>
@@ -5533,8 +6626,8 @@
         <w:pStyle w:val="Heading1"/>
         <w:rPr/>
       </w:pPr>
-      <w:bookmarkStart w:colFirst="0" w:colLast="0" w:name="_3uv23dmq0rkn" w:id="40"/>
-      <w:bookmarkEnd w:id="40"/>
+      <w:bookmarkStart w:colFirst="0" w:colLast="0" w:name="_3uv23dmq0rkn" w:id="39"/>
+      <w:bookmarkEnd w:id="39"/>
       <w:r>
         <w:rPr>
           <w:rtl w:val="0"/>
@@ -5813,8 +6906,8 @@
         <w:pStyle w:val="Heading1"/>
         <w:rPr/>
       </w:pPr>
-      <w:bookmarkStart w:colFirst="0" w:colLast="0" w:name="_egs82eygp3yy" w:id="41"/>
-      <w:bookmarkEnd w:id="41"/>
+      <w:bookmarkStart w:colFirst="0" w:colLast="0" w:name="_egs82eygp3yy" w:id="40"/>
+      <w:bookmarkEnd w:id="40"/>
       <w:r>
         <w:rPr>
           <w:rtl w:val="0"/>
@@ -6154,8 +7247,8 @@
         <w:pStyle w:val="Heading2"/>
         <w:rPr/>
       </w:pPr>
-      <w:bookmarkStart w:colFirst="0" w:colLast="0" w:name="_rn9m1ykfl3wd" w:id="42"/>
-      <w:bookmarkEnd w:id="42"/>
+      <w:bookmarkStart w:colFirst="0" w:colLast="0" w:name="_rn9m1ykfl3wd" w:id="41"/>
+      <w:bookmarkEnd w:id="41"/>
       <w:r>
         <w:rPr>
           <w:rtl w:val="0"/>

</xml_diff>

<commit_message>
docs: atualiza apostila sobre Ubuntu
</commit_message>
<xml_diff>
--- a/docx/Ubuntu/Ubuntu.docx
+++ b/docx/Ubuntu/Ubuntu.docx
@@ -60,12 +60,12 @@
           <wp:inline distB="114300" distT="114300" distL="114300" distR="114300">
             <wp:extent cx="5731200" cy="4292600"/>
             <wp:effectExtent b="0" l="0" r="0" t="0"/>
-            <wp:docPr id="2" name="image2.jpg"/>
+            <wp:docPr id="2" name="image1.jpg"/>
             <a:graphic>
               <a:graphicData uri="http://schemas.openxmlformats.org/drawingml/2006/picture">
                 <pic:pic>
                   <pic:nvPicPr>
-                    <pic:cNvPr id="0" name="image2.jpg"/>
+                    <pic:cNvPr id="0" name="image1.jpg"/>
                     <pic:cNvPicPr preferRelativeResize="0"/>
                   </pic:nvPicPr>
                   <pic:blipFill>
@@ -215,7 +215,7 @@
     </w:p>
     <w:sdt>
       <w:sdtPr>
-        <w:id w:val="1677356665"/>
+        <w:id w:val="503025260"/>
         <w:docPartObj>
           <w:docPartGallery w:val="Table of Contents"/>
           <w:docPartUnique w:val="1"/>
@@ -1028,6 +1028,165 @@
               <w:tab w:val="right" w:leader="dot" w:pos="12000"/>
             </w:tabs>
             <w:spacing w:before="60" w:line="240" w:lineRule="auto"/>
+            <w:ind w:left="360" w:firstLine="0"/>
+            <w:rPr>
+              <w:rFonts w:ascii="Arial" w:cs="Arial" w:eastAsia="Arial" w:hAnsi="Arial"/>
+              <w:b w:val="0"/>
+              <w:bCs w:val="0"/>
+              <w:i w:val="0"/>
+              <w:iCs w:val="0"/>
+              <w:smallCaps w:val="0"/>
+              <w:strike w:val="0"/>
+              <w:color w:val="000000"/>
+              <w:sz w:val="22"/>
+              <w:szCs w:val="22"/>
+              <w:u w:val="none"/>
+              <w:shd w:fill="auto" w:val="clear"/>
+              <w:vertAlign w:val="baseline"/>
+            </w:rPr>
+          </w:pPr>
+          <w:hyperlink w:anchor="_ynwyh075xfsc">
+            <w:r>
+              <w:rPr>
+                <w:rFonts w:ascii="Arial" w:cs="Arial" w:eastAsia="Arial" w:hAnsi="Arial"/>
+                <w:b w:val="0"/>
+                <w:bCs w:val="0"/>
+                <w:i w:val="0"/>
+                <w:iCs w:val="0"/>
+                <w:smallCaps w:val="0"/>
+                <w:strike w:val="0"/>
+                <w:color w:val="000000"/>
+                <w:sz w:val="22"/>
+                <w:szCs w:val="22"/>
+                <w:u w:val="none"/>
+                <w:shd w:fill="auto" w:val="clear"/>
+                <w:vertAlign w:val="baseline"/>
+                <w:rtl w:val="0"/>
+              </w:rPr>
+              <w:t xml:space="preserve">Listar Processos</w:t>
+              <w:tab/>
+              <w:t xml:space="preserve">7</w:t>
+            </w:r>
+          </w:hyperlink>
+          <w:r>
+            <w:rPr>
+              <w:rtl w:val="0"/>
+            </w:rPr>
+          </w:r>
+        </w:p>
+        <w:p>
+          <w:pPr>
+            <w:widowControl w:val="0"/>
+            <w:tabs>
+              <w:tab w:val="right" w:leader="dot" w:pos="12000"/>
+            </w:tabs>
+            <w:spacing w:before="60" w:line="240" w:lineRule="auto"/>
+            <w:ind w:left="360" w:firstLine="0"/>
+            <w:rPr>
+              <w:rFonts w:ascii="Arial" w:cs="Arial" w:eastAsia="Arial" w:hAnsi="Arial"/>
+              <w:b w:val="0"/>
+              <w:bCs w:val="0"/>
+              <w:i w:val="0"/>
+              <w:iCs w:val="0"/>
+              <w:smallCaps w:val="0"/>
+              <w:strike w:val="0"/>
+              <w:color w:val="000000"/>
+              <w:sz w:val="22"/>
+              <w:szCs w:val="22"/>
+              <w:u w:val="none"/>
+              <w:shd w:fill="auto" w:val="clear"/>
+              <w:vertAlign w:val="baseline"/>
+            </w:rPr>
+          </w:pPr>
+          <w:hyperlink w:anchor="_5shyv0ag2p18">
+            <w:r>
+              <w:rPr>
+                <w:rFonts w:ascii="Arial" w:cs="Arial" w:eastAsia="Arial" w:hAnsi="Arial"/>
+                <w:b w:val="0"/>
+                <w:bCs w:val="0"/>
+                <w:i w:val="0"/>
+                <w:iCs w:val="0"/>
+                <w:smallCaps w:val="0"/>
+                <w:strike w:val="0"/>
+                <w:color w:val="000000"/>
+                <w:sz w:val="22"/>
+                <w:szCs w:val="22"/>
+                <w:u w:val="none"/>
+                <w:shd w:fill="auto" w:val="clear"/>
+                <w:vertAlign w:val="baseline"/>
+                <w:rtl w:val="0"/>
+              </w:rPr>
+              <w:t xml:space="preserve">Listar Armazenamento e Partições</w:t>
+              <w:tab/>
+              <w:t xml:space="preserve">7</w:t>
+            </w:r>
+          </w:hyperlink>
+          <w:r>
+            <w:rPr>
+              <w:rtl w:val="0"/>
+            </w:rPr>
+          </w:r>
+        </w:p>
+        <w:p>
+          <w:pPr>
+            <w:widowControl w:val="0"/>
+            <w:tabs>
+              <w:tab w:val="right" w:leader="dot" w:pos="12000"/>
+            </w:tabs>
+            <w:spacing w:before="60" w:line="240" w:lineRule="auto"/>
+            <w:ind w:left="360" w:firstLine="0"/>
+            <w:rPr>
+              <w:rFonts w:ascii="Arial" w:cs="Arial" w:eastAsia="Arial" w:hAnsi="Arial"/>
+              <w:b w:val="0"/>
+              <w:bCs w:val="0"/>
+              <w:i w:val="0"/>
+              <w:iCs w:val="0"/>
+              <w:smallCaps w:val="0"/>
+              <w:strike w:val="0"/>
+              <w:color w:val="000000"/>
+              <w:sz w:val="22"/>
+              <w:szCs w:val="22"/>
+              <w:u w:val="none"/>
+              <w:shd w:fill="auto" w:val="clear"/>
+              <w:vertAlign w:val="baseline"/>
+            </w:rPr>
+          </w:pPr>
+          <w:hyperlink w:anchor="_feyype8owr4p">
+            <w:r>
+              <w:rPr>
+                <w:rFonts w:ascii="Arial" w:cs="Arial" w:eastAsia="Arial" w:hAnsi="Arial"/>
+                <w:b w:val="0"/>
+                <w:bCs w:val="0"/>
+                <w:i w:val="0"/>
+                <w:iCs w:val="0"/>
+                <w:smallCaps w:val="0"/>
+                <w:strike w:val="0"/>
+                <w:color w:val="000000"/>
+                <w:sz w:val="22"/>
+                <w:szCs w:val="22"/>
+                <w:u w:val="none"/>
+                <w:shd w:fill="auto" w:val="clear"/>
+                <w:vertAlign w:val="baseline"/>
+                <w:rtl w:val="0"/>
+              </w:rPr>
+              <w:t xml:space="preserve">Listar Memória</w:t>
+              <w:tab/>
+              <w:t xml:space="preserve">8</w:t>
+            </w:r>
+          </w:hyperlink>
+          <w:r>
+            <w:rPr>
+              <w:rtl w:val="0"/>
+            </w:rPr>
+          </w:r>
+        </w:p>
+        <w:p>
+          <w:pPr>
+            <w:widowControl w:val="0"/>
+            <w:tabs>
+              <w:tab w:val="right" w:leader="dot" w:pos="12000"/>
+            </w:tabs>
+            <w:spacing w:before="60" w:line="240" w:lineRule="auto"/>
             <w:rPr>
               <w:rFonts w:ascii="Arial" w:cs="Arial" w:eastAsia="Arial" w:hAnsi="Arial"/>
               <w:b w:val="1"/>
@@ -1064,7 +1223,7 @@
               </w:rPr>
               <w:t xml:space="preserve">Entendendo o Sudo</w:t>
               <w:tab/>
-              <w:t xml:space="preserve">7</w:t>
+              <w:t xml:space="preserve">8</w:t>
             </w:r>
           </w:hyperlink>
           <w:r>
@@ -1117,7 +1276,7 @@
               </w:rPr>
               <w:t xml:space="preserve">Sudo su</w:t>
               <w:tab/>
-              <w:t xml:space="preserve">7</w:t>
+              <w:t xml:space="preserve">8</w:t>
             </w:r>
           </w:hyperlink>
           <w:r>
@@ -1169,7 +1328,7 @@
               </w:rPr>
               <w:t xml:space="preserve">Atualizando Pacotes do Sistema</w:t>
               <w:tab/>
-              <w:t xml:space="preserve">8</w:t>
+              <w:t xml:space="preserve">9</w:t>
             </w:r>
           </w:hyperlink>
           <w:r>
@@ -1222,7 +1381,7 @@
               </w:rPr>
               <w:t xml:space="preserve">O update</w:t>
               <w:tab/>
-              <w:t xml:space="preserve">8</w:t>
+              <w:t xml:space="preserve">9</w:t>
             </w:r>
           </w:hyperlink>
           <w:r>
@@ -1275,7 +1434,7 @@
               </w:rPr>
               <w:t xml:space="preserve">O upgrade</w:t>
               <w:tab/>
-              <w:t xml:space="preserve">8</w:t>
+              <w:t xml:space="preserve">9</w:t>
             </w:r>
           </w:hyperlink>
           <w:r>
@@ -1328,7 +1487,7 @@
               </w:rPr>
               <w:t xml:space="preserve">O autoremove</w:t>
               <w:tab/>
-              <w:t xml:space="preserve">8</w:t>
+              <w:t xml:space="preserve">9</w:t>
             </w:r>
           </w:hyperlink>
           <w:r>
@@ -1485,7 +1644,7 @@
               </w:rPr>
               <w:t xml:space="preserve">Editores de Texto no Terminal</w:t>
               <w:tab/>
-              <w:t xml:space="preserve">9</w:t>
+              <w:t xml:space="preserve">10</w:t>
             </w:r>
           </w:hyperlink>
           <w:r>
@@ -1538,7 +1697,7 @@
               </w:rPr>
               <w:t xml:space="preserve">Nano</w:t>
               <w:tab/>
-              <w:t xml:space="preserve">9</w:t>
+              <w:t xml:space="preserve">10</w:t>
             </w:r>
           </w:hyperlink>
           <w:r>
@@ -1591,7 +1750,7 @@
               </w:rPr>
               <w:t xml:space="preserve">Vim</w:t>
               <w:tab/>
-              <w:t xml:space="preserve">11</w:t>
+              <w:t xml:space="preserve">12</w:t>
             </w:r>
           </w:hyperlink>
           <w:r>
@@ -1643,7 +1802,7 @@
               </w:rPr>
               <w:t xml:space="preserve">Atualizando Aplicativos pelo Terminal</w:t>
               <w:tab/>
-              <w:t xml:space="preserve">13</w:t>
+              <w:t xml:space="preserve">14</w:t>
             </w:r>
           </w:hyperlink>
           <w:r>
@@ -1695,7 +1854,7 @@
               </w:rPr>
               <w:t xml:space="preserve">Criando Aliases (Apelidos)</w:t>
               <w:tab/>
-              <w:t xml:space="preserve">13</w:t>
+              <w:t xml:space="preserve">14</w:t>
             </w:r>
           </w:hyperlink>
           <w:r>
@@ -1747,7 +1906,7 @@
               </w:rPr>
               <w:t xml:space="preserve">Personalizando o Terminal</w:t>
               <w:tab/>
-              <w:t xml:space="preserve">14</w:t>
+              <w:t xml:space="preserve">15</w:t>
             </w:r>
           </w:hyperlink>
           <w:r>
@@ -1800,7 +1959,7 @@
               </w:rPr>
               <w:t xml:space="preserve">Terminal Integrado VSCode</w:t>
               <w:tab/>
-              <w:t xml:space="preserve">14</w:t>
+              <w:t xml:space="preserve">15</w:t>
             </w:r>
           </w:hyperlink>
           <w:r>
@@ -4373,6 +4532,284 @@
         </w:rPr>
         <w:t xml:space="preserve">uptime -p</w:t>
       </w:r>
+    </w:p>
+    <w:p>
+      <w:pPr>
+        <w:pStyle w:val="Heading2"/>
+        <w:rPr/>
+      </w:pPr>
+      <w:bookmarkStart w:colFirst="0" w:colLast="0" w:name="_ynwyh075xfsc" w:id="22"/>
+      <w:bookmarkEnd w:id="22"/>
+      <w:r>
+        <w:rPr>
+          <w:rtl w:val="0"/>
+        </w:rPr>
+        <w:t xml:space="preserve">Listar Processos</w:t>
+      </w:r>
+    </w:p>
+    <w:p>
+      <w:pPr>
+        <w:rPr/>
+      </w:pPr>
+      <w:r>
+        <w:rPr>
+          <w:rtl w:val="0"/>
+        </w:rPr>
+        <w:t xml:space="preserve">Para listar os processos com informações sobre consumo de CPU e Memória e outras informações use</w:t>
+      </w:r>
+    </w:p>
+    <w:p>
+      <w:pPr>
+        <w:rPr>
+          <w:rFonts w:ascii="Roboto Mono" w:cs="Roboto Mono" w:eastAsia="Roboto Mono" w:hAnsi="Roboto Mono"/>
+          <w:color w:val="188038"/>
+        </w:rPr>
+      </w:pPr>
+      <w:r>
+        <w:rPr>
+          <w:rFonts w:ascii="Roboto Mono" w:cs="Roboto Mono" w:eastAsia="Roboto Mono" w:hAnsi="Roboto Mono"/>
+          <w:color w:val="188038"/>
+          <w:rtl w:val="0"/>
+        </w:rPr>
+        <w:t xml:space="preserve">top</w:t>
+      </w:r>
+    </w:p>
+    <w:p>
+      <w:pPr>
+        <w:rPr/>
+      </w:pPr>
+      <w:r>
+        <w:rPr>
+          <w:rtl w:val="0"/>
+        </w:rPr>
+      </w:r>
+    </w:p>
+    <w:p>
+      <w:pPr>
+        <w:rPr>
+          <w:rFonts w:ascii="Roboto Mono" w:cs="Roboto Mono" w:eastAsia="Roboto Mono" w:hAnsi="Roboto Mono"/>
+          <w:color w:val="188038"/>
+        </w:rPr>
+      </w:pPr>
+      <w:r>
+        <w:rPr>
+          <w:rtl w:val="0"/>
+        </w:rPr>
+        <w:t xml:space="preserve">Ele irá rodar até que você use a tecla de escape </w:t>
+      </w:r>
+      <w:r>
+        <w:rPr>
+          <w:rFonts w:ascii="Roboto Mono" w:cs="Roboto Mono" w:eastAsia="Roboto Mono" w:hAnsi="Roboto Mono"/>
+          <w:color w:val="188038"/>
+          <w:rtl w:val="0"/>
+        </w:rPr>
+        <w:t xml:space="preserve">q</w:t>
+      </w:r>
+    </w:p>
+    <w:p>
+      <w:pPr>
+        <w:pStyle w:val="Heading2"/>
+        <w:rPr/>
+      </w:pPr>
+      <w:bookmarkStart w:colFirst="0" w:colLast="0" w:name="_5shyv0ag2p18" w:id="23"/>
+      <w:bookmarkEnd w:id="23"/>
+      <w:r>
+        <w:rPr>
+          <w:rtl w:val="0"/>
+        </w:rPr>
+        <w:t xml:space="preserve">Listar Armazenamento e Partições</w:t>
+      </w:r>
+    </w:p>
+    <w:p>
+      <w:pPr>
+        <w:rPr/>
+      </w:pPr>
+      <w:r>
+        <w:rPr>
+          <w:rtl w:val="0"/>
+        </w:rPr>
+        <w:t xml:space="preserve">Para obter as informações do quanto de armazenamento consumido e disponível você tem e o quanto cada partição tem, use o comando</w:t>
+      </w:r>
+    </w:p>
+    <w:p>
+      <w:pPr>
+        <w:rPr>
+          <w:rFonts w:ascii="Roboto Mono" w:cs="Roboto Mono" w:eastAsia="Roboto Mono" w:hAnsi="Roboto Mono"/>
+          <w:color w:val="188038"/>
+        </w:rPr>
+      </w:pPr>
+      <w:r>
+        <w:rPr>
+          <w:rFonts w:ascii="Roboto Mono" w:cs="Roboto Mono" w:eastAsia="Roboto Mono" w:hAnsi="Roboto Mono"/>
+          <w:color w:val="188038"/>
+          <w:rtl w:val="0"/>
+        </w:rPr>
+        <w:t xml:space="preserve">df</w:t>
+      </w:r>
+    </w:p>
+    <w:p>
+      <w:pPr>
+        <w:rPr>
+          <w:rFonts w:ascii="Roboto Mono" w:cs="Roboto Mono" w:eastAsia="Roboto Mono" w:hAnsi="Roboto Mono"/>
+          <w:color w:val="188038"/>
+        </w:rPr>
+      </w:pPr>
+      <w:r>
+        <w:rPr>
+          <w:rtl w:val="0"/>
+        </w:rPr>
+      </w:r>
+    </w:p>
+    <w:p>
+      <w:pPr>
+        <w:rPr>
+          <w:rFonts w:ascii="Roboto Mono" w:cs="Roboto Mono" w:eastAsia="Roboto Mono" w:hAnsi="Roboto Mono"/>
+          <w:i w:val="1"/>
+          <w:iCs w:val="1"/>
+          <w:color w:val="188038"/>
+        </w:rPr>
+      </w:pPr>
+      <w:r>
+        <w:rPr>
+          <w:rtl w:val="0"/>
+        </w:rPr>
+        <w:t xml:space="preserve">Para facilitar a compreensão dos dados use a opção </w:t>
+      </w:r>
+      <w:r>
+        <w:rPr>
+          <w:rFonts w:ascii="Roboto Mono" w:cs="Roboto Mono" w:eastAsia="Roboto Mono" w:hAnsi="Roboto Mono"/>
+          <w:color w:val="188038"/>
+          <w:rtl w:val="0"/>
+        </w:rPr>
+        <w:t xml:space="preserve">-h </w:t>
+      </w:r>
+      <w:r>
+        <w:rPr>
+          <w:rtl w:val="0"/>
+        </w:rPr>
+        <w:t xml:space="preserve">que significa </w:t>
+      </w:r>
+      <w:r>
+        <w:rPr>
+          <w:i w:val="1"/>
+          <w:iCs w:val="1"/>
+          <w:rtl w:val="0"/>
+        </w:rPr>
+        <w:t xml:space="preserve">human-readable</w:t>
+      </w:r>
+      <w:r>
+        <w:rPr>
+          <w:rtl w:val="0"/>
+        </w:rPr>
+      </w:r>
+    </w:p>
+    <w:p>
+      <w:pPr>
+        <w:rPr>
+          <w:rFonts w:ascii="Roboto Mono" w:cs="Roboto Mono" w:eastAsia="Roboto Mono" w:hAnsi="Roboto Mono"/>
+          <w:color w:val="188038"/>
+        </w:rPr>
+      </w:pPr>
+      <w:r>
+        <w:rPr>
+          <w:rFonts w:ascii="Roboto Mono" w:cs="Roboto Mono" w:eastAsia="Roboto Mono" w:hAnsi="Roboto Mono"/>
+          <w:color w:val="188038"/>
+          <w:rtl w:val="0"/>
+        </w:rPr>
+        <w:t xml:space="preserve">df -h</w:t>
+      </w:r>
+    </w:p>
+    <w:p>
+      <w:pPr>
+        <w:pStyle w:val="Heading2"/>
+        <w:rPr/>
+      </w:pPr>
+      <w:bookmarkStart w:colFirst="0" w:colLast="0" w:name="_feyype8owr4p" w:id="24"/>
+      <w:bookmarkEnd w:id="24"/>
+      <w:r>
+        <w:rPr>
+          <w:rtl w:val="0"/>
+        </w:rPr>
+        <w:t xml:space="preserve">Listar Memória</w:t>
+      </w:r>
+    </w:p>
+    <w:p>
+      <w:pPr>
+        <w:rPr/>
+      </w:pPr>
+      <w:r>
+        <w:rPr>
+          <w:rtl w:val="0"/>
+        </w:rPr>
+        <w:t xml:space="preserve">Para obter informações sobre consumo de Memória e Swap, use o comando</w:t>
+      </w:r>
+    </w:p>
+    <w:p>
+      <w:pPr>
+        <w:rPr>
+          <w:rFonts w:ascii="Roboto Mono" w:cs="Roboto Mono" w:eastAsia="Roboto Mono" w:hAnsi="Roboto Mono"/>
+          <w:color w:val="188038"/>
+        </w:rPr>
+      </w:pPr>
+      <w:r>
+        <w:rPr>
+          <w:rFonts w:ascii="Roboto Mono" w:cs="Roboto Mono" w:eastAsia="Roboto Mono" w:hAnsi="Roboto Mono"/>
+          <w:color w:val="188038"/>
+          <w:rtl w:val="0"/>
+        </w:rPr>
+        <w:t xml:space="preserve">free</w:t>
+      </w:r>
+    </w:p>
+    <w:p>
+      <w:pPr>
+        <w:rPr>
+          <w:rFonts w:ascii="Roboto Mono" w:cs="Roboto Mono" w:eastAsia="Roboto Mono" w:hAnsi="Roboto Mono"/>
+          <w:color w:val="188038"/>
+        </w:rPr>
+      </w:pPr>
+      <w:r>
+        <w:rPr>
+          <w:rtl w:val="0"/>
+        </w:rPr>
+      </w:r>
+    </w:p>
+    <w:p>
+      <w:pPr>
+        <w:rPr>
+          <w:rFonts w:ascii="Roboto Mono" w:cs="Roboto Mono" w:eastAsia="Roboto Mono" w:hAnsi="Roboto Mono"/>
+          <w:color w:val="188038"/>
+        </w:rPr>
+      </w:pPr>
+      <w:r>
+        <w:rPr>
+          <w:rtl w:val="0"/>
+        </w:rPr>
+        <w:t xml:space="preserve">Para facilitar a compreensão dos dados use a opção </w:t>
+      </w:r>
+      <w:r>
+        <w:rPr>
+          <w:rFonts w:ascii="Roboto Mono" w:cs="Roboto Mono" w:eastAsia="Roboto Mono" w:hAnsi="Roboto Mono"/>
+          <w:color w:val="188038"/>
+          <w:rtl w:val="0"/>
+        </w:rPr>
+        <w:t xml:space="preserve">-h</w:t>
+      </w:r>
+    </w:p>
+    <w:p>
+      <w:pPr>
+        <w:rPr>
+          <w:rFonts w:ascii="Roboto Mono" w:cs="Roboto Mono" w:eastAsia="Roboto Mono" w:hAnsi="Roboto Mono"/>
+          <w:color w:val="188038"/>
+        </w:rPr>
+      </w:pPr>
+      <w:r>
+        <w:rPr>
+          <w:rFonts w:ascii="Roboto Mono" w:cs="Roboto Mono" w:eastAsia="Roboto Mono" w:hAnsi="Roboto Mono"/>
+          <w:color w:val="188038"/>
+          <w:rtl w:val="0"/>
+        </w:rPr>
+        <w:t xml:space="preserve">free -h</w:t>
+      </w:r>
       <w:r>
         <w:rPr>
           <w:rtl w:val="0"/>
@@ -4384,8 +4821,8 @@
         <w:pStyle w:val="Heading1"/>
         <w:rPr/>
       </w:pPr>
-      <w:bookmarkStart w:colFirst="0" w:colLast="0" w:name="_idvqtrpkbirm" w:id="22"/>
-      <w:bookmarkEnd w:id="22"/>
+      <w:bookmarkStart w:colFirst="0" w:colLast="0" w:name="_idvqtrpkbirm" w:id="25"/>
+      <w:bookmarkEnd w:id="25"/>
       <w:r>
         <w:rPr>
           <w:rtl w:val="0"/>
@@ -4500,8 +4937,8 @@
         <w:pStyle w:val="Heading2"/>
         <w:rPr/>
       </w:pPr>
-      <w:bookmarkStart w:colFirst="0" w:colLast="0" w:name="_5axrso3pwsyc" w:id="23"/>
-      <w:bookmarkEnd w:id="23"/>
+      <w:bookmarkStart w:colFirst="0" w:colLast="0" w:name="_5axrso3pwsyc" w:id="26"/>
+      <w:bookmarkEnd w:id="26"/>
       <w:r>
         <w:rPr>
           <w:rtl w:val="0"/>
@@ -4637,8 +5074,8 @@
         <w:pStyle w:val="Heading1"/>
         <w:rPr/>
       </w:pPr>
-      <w:bookmarkStart w:colFirst="0" w:colLast="0" w:name="_ehp3d3tg07" w:id="24"/>
-      <w:bookmarkEnd w:id="24"/>
+      <w:bookmarkStart w:colFirst="0" w:colLast="0" w:name="_ehp3d3tg07" w:id="27"/>
+      <w:bookmarkEnd w:id="27"/>
       <w:r>
         <w:rPr>
           <w:rtl w:val="0"/>
@@ -4667,8 +5104,8 @@
         <w:pStyle w:val="Heading2"/>
         <w:rPr/>
       </w:pPr>
-      <w:bookmarkStart w:colFirst="0" w:colLast="0" w:name="_dg9xypyug62z" w:id="25"/>
-      <w:bookmarkEnd w:id="25"/>
+      <w:bookmarkStart w:colFirst="0" w:colLast="0" w:name="_dg9xypyug62z" w:id="28"/>
+      <w:bookmarkEnd w:id="28"/>
       <w:r>
         <w:rPr>
           <w:rtl w:val="0"/>
@@ -4735,8 +5172,8 @@
         <w:pStyle w:val="Heading2"/>
         <w:rPr/>
       </w:pPr>
-      <w:bookmarkStart w:colFirst="0" w:colLast="0" w:name="_xygqdvlu2hcz" w:id="26"/>
-      <w:bookmarkEnd w:id="26"/>
+      <w:bookmarkStart w:colFirst="0" w:colLast="0" w:name="_xygqdvlu2hcz" w:id="29"/>
+      <w:bookmarkEnd w:id="29"/>
       <w:r>
         <w:rPr>
           <w:rtl w:val="0"/>
@@ -4803,8 +5240,8 @@
         <w:pStyle w:val="Heading2"/>
         <w:rPr/>
       </w:pPr>
-      <w:bookmarkStart w:colFirst="0" w:colLast="0" w:name="_k0p04tus90nt" w:id="27"/>
-      <w:bookmarkEnd w:id="27"/>
+      <w:bookmarkStart w:colFirst="0" w:colLast="0" w:name="_k0p04tus90nt" w:id="30"/>
+      <w:bookmarkEnd w:id="30"/>
       <w:r>
         <w:rPr>
           <w:rtl w:val="0"/>
@@ -4853,8 +5290,8 @@
         <w:pStyle w:val="Heading1"/>
         <w:rPr/>
       </w:pPr>
-      <w:bookmarkStart w:colFirst="0" w:colLast="0" w:name="_f42wb26veks6" w:id="28"/>
-      <w:bookmarkEnd w:id="28"/>
+      <w:bookmarkStart w:colFirst="0" w:colLast="0" w:name="_f42wb26veks6" w:id="31"/>
+      <w:bookmarkEnd w:id="31"/>
       <w:r>
         <w:rPr>
           <w:rtl w:val="0"/>
@@ -4883,8 +5320,8 @@
         <w:pStyle w:val="Heading2"/>
         <w:rPr/>
       </w:pPr>
-      <w:bookmarkStart w:colFirst="0" w:colLast="0" w:name="_z756nz7e9pwj" w:id="29"/>
-      <w:bookmarkEnd w:id="29"/>
+      <w:bookmarkStart w:colFirst="0" w:colLast="0" w:name="_z756nz7e9pwj" w:id="32"/>
+      <w:bookmarkEnd w:id="32"/>
       <w:r>
         <w:rPr>
           <w:rtl w:val="0"/>
@@ -4992,8 +5429,8 @@
         <w:pStyle w:val="Heading1"/>
         <w:rPr/>
       </w:pPr>
-      <w:bookmarkStart w:colFirst="0" w:colLast="0" w:name="_41zb618drwsd" w:id="30"/>
-      <w:bookmarkEnd w:id="30"/>
+      <w:bookmarkStart w:colFirst="0" w:colLast="0" w:name="_41zb618drwsd" w:id="33"/>
+      <w:bookmarkEnd w:id="33"/>
       <w:r>
         <w:rPr>
           <w:rtl w:val="0"/>
@@ -5091,8 +5528,8 @@
           <w:u w:val="single"/>
         </w:rPr>
       </w:pPr>
-      <w:bookmarkStart w:colFirst="0" w:colLast="0" w:name="_m662ufqzh7ul" w:id="31"/>
-      <w:bookmarkEnd w:id="31"/>
+      <w:bookmarkStart w:colFirst="0" w:colLast="0" w:name="_m662ufqzh7ul" w:id="34"/>
+      <w:bookmarkEnd w:id="34"/>
       <w:r>
         <w:rPr>
           <w:u w:val="single"/>
@@ -5106,8 +5543,8 @@
         <w:pStyle w:val="Subtitle"/>
         <w:rPr/>
       </w:pPr>
-      <w:bookmarkStart w:colFirst="0" w:colLast="0" w:name="_y5u22pq34n3" w:id="32"/>
-      <w:bookmarkEnd w:id="32"/>
+      <w:bookmarkStart w:colFirst="0" w:colLast="0" w:name="_y5u22pq34n3" w:id="35"/>
+      <w:bookmarkEnd w:id="35"/>
       <w:r>
         <w:rPr>
           <w:rtl w:val="0"/>
@@ -5198,12 +5635,12 @@
           <wp:inline distB="114300" distT="114300" distL="114300" distR="114300">
             <wp:extent cx="5731200" cy="2146300"/>
             <wp:effectExtent b="0" l="0" r="0" t="0"/>
-            <wp:docPr id="5" name="image5.png"/>
+            <wp:docPr id="5" name="image6.png"/>
             <a:graphic>
               <a:graphicData uri="http://schemas.openxmlformats.org/drawingml/2006/picture">
                 <pic:pic>
                   <pic:nvPicPr>
-                    <pic:cNvPr id="0" name="image5.png"/>
+                    <pic:cNvPr id="0" name="image6.png"/>
                     <pic:cNvPicPr preferRelativeResize="0"/>
                   </pic:nvPicPr>
                   <pic:blipFill>
@@ -5288,12 +5725,12 @@
           <wp:inline distB="114300" distT="114300" distL="114300" distR="114300">
             <wp:extent cx="5731200" cy="2146300"/>
             <wp:effectExtent b="0" l="0" r="0" t="0"/>
-            <wp:docPr id="1" name="image1.png"/>
+            <wp:docPr id="1" name="image7.png"/>
             <a:graphic>
               <a:graphicData uri="http://schemas.openxmlformats.org/drawingml/2006/picture">
                 <pic:pic>
                   <pic:nvPicPr>
-                    <pic:cNvPr id="0" name="image1.png"/>
+                    <pic:cNvPr id="0" name="image7.png"/>
                     <pic:cNvPicPr preferRelativeResize="0"/>
                   </pic:nvPicPr>
                   <pic:blipFill>
@@ -5490,8 +5927,8 @@
         <w:pStyle w:val="Subtitle"/>
         <w:rPr/>
       </w:pPr>
-      <w:bookmarkStart w:colFirst="0" w:colLast="0" w:name="_2jshjpmemad0" w:id="33"/>
-      <w:bookmarkEnd w:id="33"/>
+      <w:bookmarkStart w:colFirst="0" w:colLast="0" w:name="_2jshjpmemad0" w:id="36"/>
+      <w:bookmarkEnd w:id="36"/>
       <w:r>
         <w:rPr>
           <w:rtl w:val="0"/>
@@ -5606,12 +6043,12 @@
           <wp:inline distB="114300" distT="114300" distL="114300" distR="114300">
             <wp:extent cx="5734050" cy="2049121"/>
             <wp:effectExtent b="0" l="0" r="0" t="0"/>
-            <wp:docPr id="7" name="image7.png"/>
+            <wp:docPr id="7" name="image5.png"/>
             <a:graphic>
               <a:graphicData uri="http://schemas.openxmlformats.org/drawingml/2006/picture">
                 <pic:pic>
                   <pic:nvPicPr>
-                    <pic:cNvPr id="0" name="image7.png"/>
+                    <pic:cNvPr id="0" name="image5.png"/>
                     <pic:cNvPicPr preferRelativeResize="0"/>
                   </pic:nvPicPr>
                   <pic:blipFill>
@@ -5665,8 +6102,8 @@
           <w:szCs w:val="28"/>
         </w:rPr>
       </w:pPr>
-      <w:bookmarkStart w:colFirst="0" w:colLast="0" w:name="_emm90hbab6er" w:id="34"/>
-      <w:bookmarkEnd w:id="34"/>
+      <w:bookmarkStart w:colFirst="0" w:colLast="0" w:name="_emm90hbab6er" w:id="37"/>
+      <w:bookmarkEnd w:id="37"/>
       <w:r>
         <w:rPr>
           <w:u w:val="single"/>
@@ -5714,8 +6151,8 @@
         <w:pStyle w:val="Subtitle"/>
         <w:rPr/>
       </w:pPr>
-      <w:bookmarkStart w:colFirst="0" w:colLast="0" w:name="_pniwpyqydpbi" w:id="35"/>
-      <w:bookmarkEnd w:id="35"/>
+      <w:bookmarkStart w:colFirst="0" w:colLast="0" w:name="_pniwpyqydpbi" w:id="38"/>
+      <w:bookmarkEnd w:id="38"/>
       <w:r>
         <w:rPr>
           <w:rtl w:val="0"/>
@@ -5733,8 +6170,8 @@
           <w:szCs w:val="28"/>
         </w:rPr>
       </w:pPr>
-      <w:bookmarkStart w:colFirst="0" w:colLast="0" w:name="_k16dwldu9osb" w:id="36"/>
-      <w:bookmarkEnd w:id="36"/>
+      <w:bookmarkStart w:colFirst="0" w:colLast="0" w:name="_k16dwldu9osb" w:id="39"/>
+      <w:bookmarkEnd w:id="39"/>
       <w:r>
         <w:rPr>
           <w:rFonts w:ascii="Roboto Mono" w:cs="Roboto Mono" w:eastAsia="Roboto Mono" w:hAnsi="Roboto Mono"/>
@@ -5751,8 +6188,8 @@
         <w:pStyle w:val="Subtitle"/>
         <w:rPr/>
       </w:pPr>
-      <w:bookmarkStart w:colFirst="0" w:colLast="0" w:name="_or1h0jnittye" w:id="37"/>
-      <w:bookmarkEnd w:id="37"/>
+      <w:bookmarkStart w:colFirst="0" w:colLast="0" w:name="_or1h0jnittye" w:id="40"/>
+      <w:bookmarkEnd w:id="40"/>
       <w:r>
         <w:rPr>
           <w:rtl w:val="0"/>
@@ -5898,8 +6335,8 @@
           <w:szCs w:val="28"/>
         </w:rPr>
       </w:pPr>
-      <w:bookmarkStart w:colFirst="0" w:colLast="0" w:name="_kvzxqslinvf3" w:id="38"/>
-      <w:bookmarkEnd w:id="38"/>
+      <w:bookmarkStart w:colFirst="0" w:colLast="0" w:name="_kvzxqslinvf3" w:id="41"/>
+      <w:bookmarkEnd w:id="41"/>
       <w:r>
         <w:rPr>
           <w:rtl w:val="0"/>
@@ -6014,12 +6451,12 @@
           <wp:inline distB="114300" distT="114300" distL="114300" distR="114300">
             <wp:extent cx="5731200" cy="1803400"/>
             <wp:effectExtent b="0" l="0" r="0" t="0"/>
-            <wp:docPr id="6" name="image6.png"/>
+            <wp:docPr id="6" name="image4.png"/>
             <a:graphic>
               <a:graphicData uri="http://schemas.openxmlformats.org/drawingml/2006/picture">
                 <pic:pic>
                   <pic:nvPicPr>
-                    <pic:cNvPr id="0" name="image6.png"/>
+                    <pic:cNvPr id="0" name="image4.png"/>
                     <pic:cNvPicPr preferRelativeResize="0"/>
                   </pic:nvPicPr>
                   <pic:blipFill>
@@ -6330,12 +6767,12 @@
           <wp:inline distB="114300" distT="114300" distL="114300" distR="114300">
             <wp:extent cx="4800600" cy="762000"/>
             <wp:effectExtent b="0" l="0" r="0" t="0"/>
-            <wp:docPr id="4" name="image4.png"/>
+            <wp:docPr id="4" name="image2.png"/>
             <a:graphic>
               <a:graphicData uri="http://schemas.openxmlformats.org/drawingml/2006/picture">
                 <pic:pic>
                   <pic:nvPicPr>
-                    <pic:cNvPr id="0" name="image4.png"/>
+                    <pic:cNvPr id="0" name="image2.png"/>
                     <pic:cNvPicPr preferRelativeResize="0"/>
                   </pic:nvPicPr>
                   <pic:blipFill>
@@ -6446,8 +6883,8 @@
         <w:pStyle w:val="Heading1"/>
         <w:rPr/>
       </w:pPr>
-      <w:bookmarkStart w:colFirst="0" w:colLast="0" w:name="_7irprxdr4ezl" w:id="39"/>
-      <w:bookmarkEnd w:id="39"/>
+      <w:bookmarkStart w:colFirst="0" w:colLast="0" w:name="_7irprxdr4ezl" w:id="42"/>
+      <w:bookmarkEnd w:id="42"/>
       <w:r>
         <w:rPr>
           <w:rtl w:val="0"/>
@@ -6627,8 +7064,8 @@
         <w:pStyle w:val="Heading1"/>
         <w:rPr/>
       </w:pPr>
-      <w:bookmarkStart w:colFirst="0" w:colLast="0" w:name="_3uv23dmq0rkn" w:id="40"/>
-      <w:bookmarkEnd w:id="40"/>
+      <w:bookmarkStart w:colFirst="0" w:colLast="0" w:name="_3uv23dmq0rkn" w:id="43"/>
+      <w:bookmarkEnd w:id="43"/>
       <w:r>
         <w:rPr>
           <w:rtl w:val="0"/>
@@ -6907,8 +7344,8 @@
         <w:pStyle w:val="Heading1"/>
         <w:rPr/>
       </w:pPr>
-      <w:bookmarkStart w:colFirst="0" w:colLast="0" w:name="_egs82eygp3yy" w:id="41"/>
-      <w:bookmarkEnd w:id="41"/>
+      <w:bookmarkStart w:colFirst="0" w:colLast="0" w:name="_egs82eygp3yy" w:id="44"/>
+      <w:bookmarkEnd w:id="44"/>
       <w:r>
         <w:rPr>
           <w:rtl w:val="0"/>
@@ -7248,8 +7685,8 @@
         <w:pStyle w:val="Heading2"/>
         <w:rPr/>
       </w:pPr>
-      <w:bookmarkStart w:colFirst="0" w:colLast="0" w:name="_rn9m1ykfl3wd" w:id="42"/>
-      <w:bookmarkEnd w:id="42"/>
+      <w:bookmarkStart w:colFirst="0" w:colLast="0" w:name="_rn9m1ykfl3wd" w:id="45"/>
+      <w:bookmarkEnd w:id="45"/>
       <w:r>
         <w:rPr>
           <w:rtl w:val="0"/>

</xml_diff>